<commit_message>
docs(root): atualiza documento final e registra conclusão da revisão CCOS
</commit_message>
<xml_diff>
--- a/Documentos/2026/regulamentoDasCompeticoesCearenses.docx
+++ b/Documentos/2026/regulamentoDasCompeticoesCearenses.docx
@@ -2,7 +2,7 @@
 <file path=word/document.xml><?xml version="1.0" encoding="utf-8"?>
 <w:document xmlns:w="http://schemas.openxmlformats.org/wordprocessingml/2006/main" xmlns:m="http://schemas.openxmlformats.org/officeDocument/2006/math" xmlns:r="http://schemas.openxmlformats.org/officeDocument/2006/relationships" xmlns:o="urn:schemas-microsoft-com:office:office" xmlns:v="urn:schemas-microsoft-com:vml" xmlns:w10="urn:schemas-microsoft-com:office:word" xmlns:a="http://schemas.openxmlformats.org/drawingml/2006/main" xmlns:pic="http://schemas.openxmlformats.org/drawingml/2006/picture" xmlns:wp="http://schemas.openxmlformats.org/drawingml/2006/wordprocessingDrawing">
   <w:body>
-    <w:bookmarkStart w:id="28" w:name="X9d2b1a7d218659fd06a36ab5598bc81824129ff"/>
+    <w:bookmarkStart w:id="29" w:name="X9d2b1a7d218659fd06a36ab5598bc81824129ff"/>
     <w:p>
       <w:pPr>
         <w:pStyle w:val="Ttulo1"/>
@@ -991,6 +991,50 @@
         <w:t xml:space="preserve">O local do evento será divulgado pelo organizador no primeiro boletim informativo, que deve ser publicado até 2 (dois) dias após o término das inscrições do evento anterior.</w:t>
       </w:r>
     </w:p>
+    <w:p>
+      <w:pPr>
+        <w:pStyle w:val="FirstParagraph"/>
+      </w:pPr>
+      <w:r>
+        <w:rPr>
+          <w:b/>
+          <w:bCs/>
+        </w:rPr>
+        <w:t xml:space="preserve">Art. 7º</w:t>
+      </w:r>
+      <w:r>
+        <w:t xml:space="preserve"> </w:t>
+      </w:r>
+      <w:r>
+        <w:t xml:space="preserve">– Os Boletins com as orientações e especificações sobre cada etapa/percurso serão de responsabilidade do</w:t>
+      </w:r>
+      <w:r>
+        <w:t xml:space="preserve"> </w:t>
+      </w:r>
+      <w:r>
+        <w:rPr>
+          <w:i/>
+          <w:iCs/>
+        </w:rPr>
+        <w:t xml:space="preserve">Diretor do Evento</w:t>
+      </w:r>
+      <w:r>
+        <w:t xml:space="preserve">, que os emitirá com anuência do</w:t>
+      </w:r>
+      <w:r>
+        <w:t xml:space="preserve"> </w:t>
+      </w:r>
+      <w:r>
+        <w:rPr>
+          <w:i/>
+          <w:iCs/>
+        </w:rPr>
+        <w:t xml:space="preserve">Árbitro</w:t>
+      </w:r>
+      <w:r>
+        <w:t xml:space="preserve">, conforme itens 5.1 e 35.6 da ROP.</w:t>
+      </w:r>
+    </w:p>
     <w:bookmarkEnd w:id="20"/>
     <w:bookmarkEnd w:id="21"/>
     <w:bookmarkStart w:id="22" w:name="das-categorias-e-uniformes"/>
@@ -1011,7 +1055,7 @@
           <w:b/>
           <w:bCs/>
         </w:rPr>
-        <w:t xml:space="preserve">Art. 7º</w:t>
+        <w:t xml:space="preserve">Art. 8º</w:t>
       </w:r>
       <w:r>
         <w:t xml:space="preserve"> </w:t>
@@ -1030,6 +1074,24 @@
           <w:bCs/>
         </w:rPr>
         <w:t xml:space="preserve">Parágrafo 1º:</w:t>
+      </w:r>
+      <w:r>
+        <w:t xml:space="preserve"> </w:t>
+      </w:r>
+      <w:r>
+        <w:t xml:space="preserve">Recomenda-se que a primeira inscrição de um atleta iniciante seja em uma das categorias acompanhadas.</w:t>
+      </w:r>
+    </w:p>
+    <w:p>
+      <w:pPr>
+        <w:pStyle w:val="Textoembloco"/>
+      </w:pPr>
+      <w:r>
+        <w:rPr>
+          <w:b/>
+          <w:bCs/>
+        </w:rPr>
+        <w:t xml:space="preserve">Parágrafo 2º:</w:t>
       </w:r>
       <w:r>
         <w:t xml:space="preserve"> </w:t>
@@ -1079,7 +1141,7 @@
           <w:b/>
           <w:bCs/>
         </w:rPr>
-        <w:t xml:space="preserve">Art. 8º</w:t>
+        <w:t xml:space="preserve">Art. 9º</w:t>
       </w:r>
       <w:r>
         <w:t xml:space="preserve"> </w:t>
@@ -1149,7 +1211,7 @@
           <w:b/>
           <w:bCs/>
         </w:rPr>
-        <w:t xml:space="preserve">Art. 9º</w:t>
+        <w:t xml:space="preserve">Art. 10</w:t>
       </w:r>
       <w:r>
         <w:t xml:space="preserve"> </w:t>
@@ -1245,7 +1307,7 @@
           <w:b/>
           <w:bCs/>
         </w:rPr>
-        <w:t xml:space="preserve">Art. 10</w:t>
+        <w:t xml:space="preserve">Art. 11</w:t>
       </w:r>
       <w:r>
         <w:t xml:space="preserve"> </w:t>
@@ -1305,6 +1367,24 @@
         <w:t xml:space="preserve"> </w:t>
       </w:r>
       <w:r>
+        <w:t xml:space="preserve">Os atletas são responsáveis pelos dados informados à CBO e devem sempre mantê-los atualizados. O organizador de uma etapa não tem acesso para fazer ajustes no cadastro do atleta. É de responsabilidade do atleta verificar se os dados estão corretos e atualizados.</w:t>
+      </w:r>
+    </w:p>
+    <w:p>
+      <w:pPr>
+        <w:pStyle w:val="Textoembloco"/>
+      </w:pPr>
+      <w:r>
+        <w:rPr>
+          <w:b/>
+          <w:bCs/>
+        </w:rPr>
+        <w:t xml:space="preserve">Parágrafo 4º:</w:t>
+      </w:r>
+      <w:r>
+        <w:t xml:space="preserve"> </w:t>
+      </w:r>
+      <w:r>
         <w:t xml:space="preserve">A organização poderá recusar inscrições realizadas com dados ou valores incorretos ou incompletos, ou fora do prazo de inscrição.</w:t>
       </w:r>
     </w:p>
@@ -1317,13 +1397,13 @@
           <w:b/>
           <w:bCs/>
         </w:rPr>
-        <w:t xml:space="preserve">Parágrafo 4º:</w:t>
-      </w:r>
-      <w:r>
-        <w:t xml:space="preserve"> </w:t>
-      </w:r>
-      <w:r>
-        <w:t xml:space="preserve">Caso o site da FECORI não esteja disponível por questões técnicas, a alternativa para inscrição será informada em boletim. Os atletas são responsáveis pelos dados informados à CBO.</w:t>
+        <w:t xml:space="preserve">Parágrafo 5º:</w:t>
+      </w:r>
+      <w:r>
+        <w:t xml:space="preserve"> </w:t>
+      </w:r>
+      <w:r>
+        <w:t xml:space="preserve">Caso o sistema de inscrição não esteja disponível por questões técnicas, a alternativa para inscrição será informada em boletim. Os atletas são responsáveis pelos dados informados à CBO.</w:t>
       </w:r>
     </w:p>
     <w:p>
@@ -1335,7 +1415,7 @@
           <w:b/>
           <w:bCs/>
         </w:rPr>
-        <w:t xml:space="preserve">Art. 11</w:t>
+        <w:t xml:space="preserve">Art. 12</w:t>
       </w:r>
       <w:r>
         <w:t xml:space="preserve"> </w:t>
@@ -1377,7 +1457,7 @@
         <w:t xml:space="preserve"> </w:t>
       </w:r>
       <w:r>
-        <w:t xml:space="preserve">Será considerado como autorização caso o responsável participe da etapa e não faça nenhuma manifestação contrária no período de correção (previsto no Art. 14).</w:t>
+        <w:t xml:space="preserve">Será considerado como autorização caso o responsável participe da etapa e não faça nenhuma manifestação contrária no período de correção (previsto no Art. 15).</w:t>
       </w:r>
     </w:p>
     <w:p>
@@ -1389,7 +1469,7 @@
           <w:b/>
           <w:bCs/>
         </w:rPr>
-        <w:t xml:space="preserve">Art. 12</w:t>
+        <w:t xml:space="preserve">Art. 13</w:t>
       </w:r>
       <w:r>
         <w:t xml:space="preserve"> </w:t>
@@ -1443,7 +1523,7 @@
           <w:b/>
           <w:bCs/>
         </w:rPr>
-        <w:t xml:space="preserve">Art. 13</w:t>
+        <w:t xml:space="preserve">Art. 14</w:t>
       </w:r>
       <w:r>
         <w:t xml:space="preserve"> </w:t>
@@ -1461,13 +1541,13 @@
           <w:b/>
           <w:bCs/>
         </w:rPr>
-        <w:t xml:space="preserve">Art. 14</w:t>
-      </w:r>
-      <w:r>
-        <w:t xml:space="preserve"> </w:t>
-      </w:r>
-      <w:r>
-        <w:t xml:space="preserve">– A lista de inscritos estará disponível no site da FECORI para conferência. O técnico do clube e o próprio atleta são responsáveis por verificar os dados registrados e solicitar eventuais correções até 5 (cinco) dias antes da competição.</w:t>
+        <w:t xml:space="preserve">Art. 15</w:t>
+      </w:r>
+      <w:r>
+        <w:t xml:space="preserve"> </w:t>
+      </w:r>
+      <w:r>
+        <w:t xml:space="preserve">– A lista de inscritos estará disponível na página do evento no site da FECORI para conferência. O técnico do clube e o próprio atleta são responsáveis por verificar os dados registrados e solicitar eventuais correções até 5 (cinco) dias antes da competição. As eventuais correções solicitadas no prazo devem constar na lista de partida até 1 (um) dia antes da competição.</w:t>
       </w:r>
     </w:p>
     <w:p>
@@ -1485,7 +1565,7 @@
         <w:t xml:space="preserve"> </w:t>
       </w:r>
       <w:r>
-        <w:t xml:space="preserve">Passado o prazo, o organizador pode recusar correções, e o atleta competirá com os dados registrados, assumindo eventuais impactos em pontuação/classificação.</w:t>
+        <w:t xml:space="preserve">Passado o prazo, o organizador pode recusar correções, e o atleta competirá com os dados registrados, assumindo, inclusive, riscos de desclassificação ou perda de pontuação.</w:t>
       </w:r>
     </w:p>
     <w:p>
@@ -1497,7 +1577,7 @@
           <w:b/>
           <w:bCs/>
         </w:rPr>
-        <w:t xml:space="preserve">Art. 15</w:t>
+        <w:t xml:space="preserve">Art. 16</w:t>
       </w:r>
       <w:r>
         <w:t xml:space="preserve"> </w:t>
@@ -1515,7 +1595,7 @@
           <w:b/>
           <w:bCs/>
         </w:rPr>
-        <w:t xml:space="preserve">Art. 16</w:t>
+        <w:t xml:space="preserve">Art. 17</w:t>
       </w:r>
       <w:r>
         <w:t xml:space="preserve"> </w:t>
@@ -1543,7 +1623,7 @@
           <w:b/>
           <w:bCs/>
         </w:rPr>
-        <w:t xml:space="preserve">Art. 17</w:t>
+        <w:t xml:space="preserve">Art. 18</w:t>
       </w:r>
       <w:r>
         <w:t xml:space="preserve"> </w:t>
@@ -1561,7 +1641,7 @@
           <w:b/>
           <w:bCs/>
         </w:rPr>
-        <w:t xml:space="preserve">Art. 18</w:t>
+        <w:t xml:space="preserve">Art. 19</w:t>
       </w:r>
       <w:r>
         <w:t xml:space="preserve"> </w:t>
@@ -1579,7 +1659,7 @@
           <w:b/>
           <w:bCs/>
         </w:rPr>
-        <w:t xml:space="preserve">Art. 19</w:t>
+        <w:t xml:space="preserve">Art. 20</w:t>
       </w:r>
       <w:r>
         <w:t xml:space="preserve"> </w:t>
@@ -1597,7 +1677,7 @@
           <w:b/>
           <w:bCs/>
         </w:rPr>
-        <w:t xml:space="preserve">Art. 20</w:t>
+        <w:t xml:space="preserve">Art. 21</w:t>
       </w:r>
       <w:r>
         <w:t xml:space="preserve"> </w:t>
@@ -1615,7 +1695,7 @@
           <w:b/>
           <w:bCs/>
         </w:rPr>
-        <w:t xml:space="preserve">Art. 21</w:t>
+        <w:t xml:space="preserve">Art. 22</w:t>
       </w:r>
       <w:r>
         <w:t xml:space="preserve"> </w:t>
@@ -1685,7 +1765,7 @@
           <w:b/>
           <w:bCs/>
         </w:rPr>
-        <w:t xml:space="preserve">Art. 22</w:t>
+        <w:t xml:space="preserve">Art. 23</w:t>
       </w:r>
       <w:r>
         <w:t xml:space="preserve"> </w:t>
@@ -1735,7 +1815,7 @@
           <w:b/>
           <w:bCs/>
         </w:rPr>
-        <w:t xml:space="preserve">Art. 23</w:t>
+        <w:t xml:space="preserve">Art. 24</w:t>
       </w:r>
       <w:r>
         <w:t xml:space="preserve"> </w:t>
@@ -2041,7 +2121,7 @@
           <w:b/>
           <w:bCs/>
         </w:rPr>
-        <w:t xml:space="preserve">Art. 24</w:t>
+        <w:t xml:space="preserve">Art. 25</w:t>
       </w:r>
       <w:r>
         <w:t xml:space="preserve"> </w:t>
@@ -2107,7 +2187,7 @@
           <w:b/>
           <w:bCs/>
         </w:rPr>
-        <w:t xml:space="preserve">Art. 25</w:t>
+        <w:t xml:space="preserve">Art. 26</w:t>
       </w:r>
       <w:r>
         <w:t xml:space="preserve"> </w:t>
@@ -2118,6 +2198,70 @@
     </w:p>
     <w:p>
       <w:pPr>
+        <w:pStyle w:val="Textoembloco"/>
+      </w:pPr>
+      <w:r>
+        <w:rPr>
+          <w:b/>
+          <w:bCs/>
+        </w:rPr>
+        <w:t xml:space="preserve">Parágrafo 1º:</w:t>
+      </w:r>
+      <w:r>
+        <w:t xml:space="preserve"> </w:t>
+      </w:r>
+      <w:r>
+        <w:t xml:space="preserve">A contestação só poderá ser feita em relação ao resultado final do campeonato.</w:t>
+      </w:r>
+    </w:p>
+    <w:p>
+      <w:pPr>
+        <w:pStyle w:val="FirstParagraph"/>
+      </w:pPr>
+      <w:r>
+        <w:rPr>
+          <w:b/>
+          <w:bCs/>
+        </w:rPr>
+        <w:t xml:space="preserve">Art. 27</w:t>
+      </w:r>
+      <w:r>
+        <w:t xml:space="preserve"> </w:t>
+      </w:r>
+      <w:r>
+        <w:t xml:space="preserve">– O objetivo, composição e prerrogativas do Júri Técnico obedecem às DIRETRIZES PARA OS JÚRIS EM EVENTOS OFICIAIS da CBO e ao item 38 da ROP.</w:t>
+      </w:r>
+    </w:p>
+    <w:bookmarkEnd w:id="25"/>
+    <w:bookmarkStart w:id="26" w:name="da-segurança"/>
+    <w:p>
+      <w:pPr>
+        <w:pStyle w:val="Ttulo2"/>
+      </w:pPr>
+      <w:r>
+        <w:t xml:space="preserve">7. Da Segurança</w:t>
+      </w:r>
+    </w:p>
+    <w:p>
+      <w:pPr>
+        <w:pStyle w:val="FirstParagraph"/>
+      </w:pPr>
+      <w:r>
+        <w:rPr>
+          <w:b/>
+          <w:bCs/>
+        </w:rPr>
+        <w:t xml:space="preserve">Art. 28</w:t>
+      </w:r>
+      <w:r>
+        <w:t xml:space="preserve"> </w:t>
+      </w:r>
+      <w:r>
+        <w:t xml:space="preserve">– A Organização deverá empregar todos os esforços para atender às exigências e regras do desporto orientação com relação à segurança individual dos atletas.</w:t>
+      </w:r>
+    </w:p>
+    <w:p>
+      <w:pPr>
         <w:pStyle w:val="Corpodetexto"/>
       </w:pPr>
       <w:r>
@@ -2125,23 +2269,41 @@
           <w:b/>
           <w:bCs/>
         </w:rPr>
-        <w:t xml:space="preserve">Art. 26</w:t>
-      </w:r>
-      <w:r>
-        <w:t xml:space="preserve"> </w:t>
-      </w:r>
-      <w:r>
-        <w:t xml:space="preserve">– O objetivo, composição e prerrogativas do Júri Técnico obedecem às DIRETRIZES PARA OS JÚRIS EM EVENTOS OFICIAIS da CBO e ao item 38 da ROP.</w:t>
-      </w:r>
-    </w:p>
-    <w:bookmarkEnd w:id="25"/>
-    <w:bookmarkStart w:id="26" w:name="da-pontuação-e-apuração-do-campeonato"/>
+        <w:t xml:space="preserve">Art. 29</w:t>
+      </w:r>
+      <w:r>
+        <w:t xml:space="preserve"> </w:t>
+      </w:r>
+      <w:r>
+        <w:t xml:space="preserve">– O traçado dos percursos deverá atender com rigor e sensibilidade às exigências técnicas para cada categoria.</w:t>
+      </w:r>
+    </w:p>
+    <w:p>
+      <w:pPr>
+        <w:pStyle w:val="Corpodetexto"/>
+      </w:pPr>
+      <w:r>
+        <w:rPr>
+          <w:b/>
+          <w:bCs/>
+        </w:rPr>
+        <w:t xml:space="preserve">Art. 30</w:t>
+      </w:r>
+      <w:r>
+        <w:t xml:space="preserve"> </w:t>
+      </w:r>
+      <w:r>
+        <w:t xml:space="preserve">– Deverão ser ressaltados nos avisos preliminares, antes da partida da primeira bateria de atletas, bem como indicados nos mapas, os pontos que apresentam qualquer perigo ou áreas interditadas para a competição.</w:t>
+      </w:r>
+    </w:p>
+    <w:bookmarkEnd w:id="26"/>
+    <w:bookmarkStart w:id="27" w:name="da-pontuação-e-apuração-do-campeonato"/>
     <w:p>
       <w:pPr>
         <w:pStyle w:val="Ttulo2"/>
       </w:pPr>
       <w:r>
-        <w:t xml:space="preserve">7. Da Pontuação e Apuração do Campeonato</w:t>
+        <w:t xml:space="preserve">8. Da Pontuação e Apuração do Campeonato</w:t>
       </w:r>
     </w:p>
     <w:p>
@@ -2153,7 +2315,7 @@
           <w:b/>
           <w:bCs/>
         </w:rPr>
-        <w:t xml:space="preserve">Art. 27</w:t>
+        <w:t xml:space="preserve">Art. 31</w:t>
       </w:r>
       <w:r>
         <w:t xml:space="preserve"> </w:t>
@@ -2175,7 +2337,7 @@
         <w:t xml:space="preserve"> </w:t>
       </w:r>
       <w:r>
-        <w:t xml:space="preserve">da ROP, em cada categoria, os 26 (vinte e seis) primeiros colocados em cada etapa (CCO) ou percurso (CCOS) receberão a seguinte pontuação:</w:t>
+        <w:t xml:space="preserve">da ROP, em cada categoria, os 26 (vinte e seis) primeiros colocados em cada etapa/percurso receberão a seguinte pontuação:</w:t>
       </w:r>
       <w:r>
         <w:t xml:space="preserve"> </w:t>
@@ -2254,7 +2416,7 @@
           <w:b/>
           <w:bCs/>
         </w:rPr>
-        <w:t xml:space="preserve">Art. 28</w:t>
+        <w:t xml:space="preserve">Art. 32</w:t>
       </w:r>
       <w:r>
         <w:t xml:space="preserve"> </w:t>
@@ -2265,14 +2427,50 @@
     </w:p>
     <w:p>
       <w:pPr>
-        <w:pStyle w:val="Corpodetexto"/>
-      </w:pPr>
-      <w:r>
-        <w:rPr>
-          <w:b/>
-          <w:bCs/>
-        </w:rPr>
-        <w:t xml:space="preserve">Art. 29</w:t>
+        <w:pStyle w:val="Textoembloco"/>
+      </w:pPr>
+      <w:r>
+        <w:rPr>
+          <w:b/>
+          <w:bCs/>
+        </w:rPr>
+        <w:t xml:space="preserve">Parágrafo 1º:</w:t>
+      </w:r>
+      <w:r>
+        <w:t xml:space="preserve"> </w:t>
+      </w:r>
+      <w:r>
+        <w:t xml:space="preserve">É responsabilidade de todos (dirigentes, técnicos, responsáveis e atletas) a adequada distribuição e inscrição dos atletas nas categorias corretas, conforme o item 2.10 da ROP.</w:t>
+      </w:r>
+    </w:p>
+    <w:p>
+      <w:pPr>
+        <w:pStyle w:val="Textoembloco"/>
+      </w:pPr>
+      <w:r>
+        <w:rPr>
+          <w:b/>
+          <w:bCs/>
+        </w:rPr>
+        <w:t xml:space="preserve">Parágrafo 2º:</w:t>
+      </w:r>
+      <w:r>
+        <w:t xml:space="preserve"> </w:t>
+      </w:r>
+      <w:r>
+        <w:t xml:space="preserve">Os casos de mudança de categoria devem respeitar o período de correção previsto no Art. 15 deste regulamento.</w:t>
+      </w:r>
+    </w:p>
+    <w:p>
+      <w:pPr>
+        <w:pStyle w:val="FirstParagraph"/>
+      </w:pPr>
+      <w:r>
+        <w:rPr>
+          <w:b/>
+          <w:bCs/>
+        </w:rPr>
+        <w:t xml:space="preserve">Art. 33</w:t>
       </w:r>
       <w:r>
         <w:t xml:space="preserve"> </w:t>
@@ -2294,7 +2492,7 @@
         <w:t xml:space="preserve"> </w:t>
       </w:r>
       <w:r>
-        <w:t xml:space="preserve">Atletas envolvidos na organização e impedidos de competir poderão receber a média da pontuação de suas outras participações, desde que autorizados pelo árbitro e cujo percurso da categoria não tenha sido anulado:</w:t>
+        <w:t xml:space="preserve">Atletas convocados formalmente por seus clubes para atuarem na equipe organizadora — ou convocados pela FECORI para atuar como árbitro — e impedidos de competir, poderão receber a média da pontuação de suas outras participações, desde que autorizados pelo árbitro e cujo percurso da categoria não tenha sido anulado:</w:t>
       </w:r>
     </w:p>
     <w:p>
@@ -2348,352 +2546,352 @@
         <w:t xml:space="preserve"> </w:t>
       </w:r>
       <w:r>
+        <w:t xml:space="preserve">Qualquer atleta poderá se candidatar a participar como voluntário da organização de um evento, desde que a entidade organizadora aceite, mas só receberão a média da pontuação aqueles enquadrados neste artigo.</w:t>
+      </w:r>
+    </w:p>
+    <w:p>
+      <w:pPr>
+        <w:pStyle w:val="Textoembloco"/>
+      </w:pPr>
+      <w:r>
+        <w:rPr>
+          <w:b/>
+          <w:bCs/>
+        </w:rPr>
+        <w:t xml:space="preserve">Parágrafo 4º:</w:t>
+      </w:r>
+      <w:r>
+        <w:t xml:space="preserve"> </w:t>
+      </w:r>
+      <w:r>
         <w:t xml:space="preserve">A lista com os voluntários que serão beneficiados com a média deve ser reportada ao árbitro e à FECORI ao término da apuração (CCOS) ou em até 15 dias (CCO).</w:t>
       </w:r>
     </w:p>
     <w:p>
       <w:pPr>
-        <w:pStyle w:val="FirstParagraph"/>
-      </w:pPr>
-      <w:r>
-        <w:rPr>
-          <w:b/>
-          <w:bCs/>
-        </w:rPr>
-        <w:t xml:space="preserve">Art. 30</w:t>
-      </w:r>
-      <w:r>
-        <w:t xml:space="preserve"> </w:t>
-      </w:r>
-      <w:r>
-        <w:t xml:space="preserve">– A classificação individual geral será o somatório de todos os pontos obtidos (em todas as etapas do CCO ou todos os percursos do CCOS),</w:t>
-      </w:r>
-      <w:r>
-        <w:t xml:space="preserve"> </w:t>
-      </w:r>
-      <w:r>
-        <w:rPr>
-          <w:b/>
-          <w:bCs/>
-        </w:rPr>
-        <w:t xml:space="preserve">sem descartes</w:t>
-      </w:r>
-      <w:r>
-        <w:t xml:space="preserve">.</w:t>
-      </w:r>
-    </w:p>
-    <w:p>
-      <w:pPr>
-        <w:pStyle w:val="Textoembloco"/>
-      </w:pPr>
-      <w:r>
-        <w:rPr>
-          <w:b/>
-          <w:bCs/>
-        </w:rPr>
-        <w:t xml:space="preserve">Parágrafo Único:</w:t>
-      </w:r>
-      <w:r>
-        <w:t xml:space="preserve"> </w:t>
-      </w:r>
-      <w:r>
-        <w:t xml:space="preserve">Em caso de empate individual, prevalece:</w:t>
-      </w:r>
-    </w:p>
-    <w:p>
-      <w:pPr>
-        <w:pStyle w:val="Textoembloco"/>
-      </w:pPr>
-      <w:r>
-        <w:rPr>
-          <w:b/>
-          <w:bCs/>
-        </w:rPr>
-        <w:t xml:space="preserve">a.</w:t>
-      </w:r>
-      <w:r>
-        <w:t xml:space="preserve"> </w:t>
-      </w:r>
-      <w:r>
-        <w:t xml:space="preserve">Maior número de primeiros lugares, depois segundos, etc;</w:t>
-      </w:r>
-    </w:p>
-    <w:p>
-      <w:pPr>
-        <w:pStyle w:val="Textoembloco"/>
-      </w:pPr>
-      <w:r>
-        <w:rPr>
-          <w:b/>
-          <w:bCs/>
-        </w:rPr>
-        <w:t xml:space="preserve">b.</w:t>
-      </w:r>
-      <w:r>
-        <w:t xml:space="preserve"> </w:t>
-      </w:r>
-      <w:r>
-        <w:t xml:space="preserve">Melhor resultado no último confronto direto (CCO) ou classificação no último percurso (CCOS);</w:t>
-      </w:r>
-    </w:p>
-    <w:p>
-      <w:pPr>
-        <w:pStyle w:val="Textoembloco"/>
-      </w:pPr>
-      <w:r>
-        <w:rPr>
-          <w:b/>
-          <w:bCs/>
-        </w:rPr>
-        <w:t xml:space="preserve">c.</w:t>
-      </w:r>
-      <w:r>
-        <w:t xml:space="preserve"> </w:t>
-      </w:r>
-      <w:r>
-        <w:t xml:space="preserve">Maior idade (CCO). No CCOS, permanecendo o empate na alínea</w:t>
-      </w:r>
-      <w:r>
-        <w:t xml:space="preserve"> </w:t>
-      </w:r>
-      <w:r>
-        <w:t xml:space="preserve">‘b’</w:t>
-      </w:r>
-      <w:r>
-        <w:t xml:space="preserve">, o empate será definitivo e ambos recebem a mesma premiação.</w:t>
-      </w:r>
-    </w:p>
-    <w:p>
-      <w:pPr>
-        <w:pStyle w:val="FirstParagraph"/>
-      </w:pPr>
-      <w:r>
-        <w:rPr>
-          <w:b/>
-          <w:bCs/>
-        </w:rPr>
-        <w:t xml:space="preserve">Art. 31</w:t>
-      </w:r>
-      <w:r>
-        <w:t xml:space="preserve"> </w:t>
-      </w:r>
-      <w:r>
-        <w:t xml:space="preserve">– A pontuação dos clubes (em ambas as competições) será dada pela soma dos pontos dos seus</w:t>
-      </w:r>
-      <w:r>
-        <w:t xml:space="preserve"> </w:t>
-      </w:r>
-      <w:r>
-        <w:rPr>
-          <w:b/>
-          <w:bCs/>
-        </w:rPr>
-        <w:t xml:space="preserve">três atletas filiados melhores classificados em cada categoria</w:t>
-      </w:r>
-      <w:r>
-        <w:t xml:space="preserve">, por etapa (CCO) ou percurso (CCOS). Clubes não filiados não participam do resultado de clubes.</w:t>
-      </w:r>
-    </w:p>
-    <w:p>
-      <w:pPr>
-        <w:pStyle w:val="Textoembloco"/>
-      </w:pPr>
-      <w:r>
-        <w:rPr>
-          <w:b/>
-          <w:bCs/>
-        </w:rPr>
-        <w:t xml:space="preserve">Parágrafo Único:</w:t>
-      </w:r>
-      <w:r>
-        <w:t xml:space="preserve"> </w:t>
-      </w:r>
-      <w:r>
-        <w:t xml:space="preserve">Em caso de empate entre clubes, vence o que tiver mais primeiros lugares, depois segundos, sucessivamente.</w:t>
-      </w:r>
-    </w:p>
-    <w:bookmarkEnd w:id="26"/>
-    <w:bookmarkStart w:id="27" w:name="da-premiação"/>
-    <w:p>
-      <w:pPr>
-        <w:pStyle w:val="Ttulo2"/>
-      </w:pPr>
-      <w:r>
-        <w:t xml:space="preserve">8. Da Premiação</w:t>
-      </w:r>
-    </w:p>
-    <w:p>
-      <w:pPr>
-        <w:pStyle w:val="FirstParagraph"/>
-      </w:pPr>
-      <w:r>
-        <w:rPr>
-          <w:b/>
-          <w:bCs/>
-        </w:rPr>
-        <w:t xml:space="preserve">Art. 32</w:t>
-      </w:r>
-      <w:r>
-        <w:t xml:space="preserve"> </w:t>
-      </w:r>
-      <w:r>
-        <w:t xml:space="preserve">– Não haverá premiação por etapa/percurso, ocorrendo apenas no final de cada campeonato.</w:t>
-      </w:r>
-    </w:p>
-    <w:p>
-      <w:pPr>
-        <w:pStyle w:val="Corpodetexto"/>
-      </w:pPr>
-      <w:r>
-        <w:rPr>
-          <w:b/>
-          <w:bCs/>
-        </w:rPr>
-        <w:t xml:space="preserve">Art. 33</w:t>
-      </w:r>
-      <w:r>
-        <w:t xml:space="preserve"> </w:t>
-      </w:r>
-      <w:r>
-        <w:t xml:space="preserve">– Os</w:t>
-      </w:r>
-      <w:r>
-        <w:t xml:space="preserve"> </w:t>
-      </w:r>
-      <w:r>
-        <w:rPr>
-          <w:b/>
-          <w:bCs/>
-        </w:rPr>
-        <w:t xml:space="preserve">atletas</w:t>
-      </w:r>
-      <w:r>
-        <w:t xml:space="preserve"> </w:t>
-      </w:r>
-      <w:r>
-        <w:t xml:space="preserve">campeões, vice-campeões e terceiros lugares em cada categoria (incluindo Novatos) serão premiados com</w:t>
-      </w:r>
-      <w:r>
-        <w:t xml:space="preserve"> </w:t>
-      </w:r>
-      <w:r>
-        <w:rPr>
-          <w:b/>
-          <w:bCs/>
-        </w:rPr>
-        <w:t xml:space="preserve">medalhas</w:t>
-      </w:r>
-      <w:r>
-        <w:t xml:space="preserve"> </w:t>
-      </w:r>
-      <w:r>
-        <w:t xml:space="preserve">em cada campeonato.</w:t>
-      </w:r>
-    </w:p>
-    <w:p>
-      <w:pPr>
-        <w:pStyle w:val="Corpodetexto"/>
-      </w:pPr>
-      <w:r>
-        <w:rPr>
-          <w:b/>
-          <w:bCs/>
-        </w:rPr>
-        <w:t xml:space="preserve">Art. 34</w:t>
-      </w:r>
-      <w:r>
-        <w:t xml:space="preserve"> </w:t>
-      </w:r>
-      <w:r>
-        <w:t xml:space="preserve">– Os</w:t>
-      </w:r>
-      <w:r>
-        <w:t xml:space="preserve"> </w:t>
-      </w:r>
-      <w:r>
-        <w:rPr>
-          <w:b/>
-          <w:bCs/>
-        </w:rPr>
-        <w:t xml:space="preserve">3 (três) clubes melhor pontuados</w:t>
-      </w:r>
-      <w:r>
-        <w:t xml:space="preserve"> </w:t>
-      </w:r>
-      <w:r>
-        <w:t xml:space="preserve">ao final de cada campeonato serão premiados com</w:t>
-      </w:r>
-      <w:r>
-        <w:t xml:space="preserve"> </w:t>
-      </w:r>
-      <w:r>
-        <w:rPr>
-          <w:b/>
-          <w:bCs/>
-        </w:rPr>
-        <w:t xml:space="preserve">troféus</w:t>
-      </w:r>
-      <w:r>
-        <w:t xml:space="preserve">.</w:t>
-      </w:r>
-    </w:p>
-    <w:p>
-      <w:pPr>
-        <w:pStyle w:val="Textoembloco"/>
-      </w:pPr>
-      <w:r>
-        <w:rPr>
-          <w:b/>
-          <w:bCs/>
-        </w:rPr>
-        <w:t xml:space="preserve">Parágrafo 1º:</w:t>
-      </w:r>
-      <w:r>
-        <w:t xml:space="preserve"> </w:t>
-      </w:r>
-      <w:r>
-        <w:t xml:space="preserve">Têm direito à premiação final apenas atletas filiados que participarem de no mínimo metade dos percursos/etapas realizados e estiverem em situação regular com a FECORI.</w:t>
-      </w:r>
-    </w:p>
-    <w:p>
-      <w:pPr>
-        <w:pStyle w:val="Textoembloco"/>
-      </w:pPr>
-      <w:r>
-        <w:rPr>
-          <w:b/>
-          <w:bCs/>
-        </w:rPr>
-        <w:t xml:space="preserve">Parágrafo 2º:</w:t>
-      </w:r>
-      <w:r>
-        <w:t xml:space="preserve"> </w:t>
-      </w:r>
-      <w:r>
-        <w:t xml:space="preserve">Na ausência do atleta ou representante de clube na cerimônia, o prêmio poderá ser despachado com custas ressarcidas pelo recebedor.</w:t>
-      </w:r>
-    </w:p>
-    <w:p>
-      <w:r>
-        <w:pict>
-          <v:rect style="width:0;height:1.5pt" o:hralign="center" o:hrstd="t" o:hr="t"/>
-        </w:pict>
-      </w:r>
-    </w:p>
-    <w:p>
-      <w:pPr>
-        <w:pStyle w:val="FirstParagraph"/>
-      </w:pPr>
+        <w:pStyle w:val="Textoembloco"/>
+      </w:pPr>
+      <w:r>
+        <w:rPr>
+          <w:b/>
+          <w:bCs/>
+        </w:rPr>
+        <w:t xml:space="preserve">Parágrafo 5º:</w:t>
+      </w:r>
+      <w:r>
+        <w:t xml:space="preserve"> </w:t>
+      </w:r>
+      <w:r>
+        <w:t xml:space="preserve">O árbitro do evento elaborará o seu Relatório, previsto nas</w:t>
+      </w:r>
+      <w:r>
+        <w:t xml:space="preserve"> </w:t>
+      </w:r>
       <w:r>
         <w:rPr>
           <w:i/>
           <w:iCs/>
         </w:rPr>
-        <w:t xml:space="preserve">Fortaleza/CE, 23 de abril de 2026.</w:t>
+        <w:t xml:space="preserve">DIRETRIZES PARA EVENTOS</w:t>
+      </w:r>
+      <w:r>
+        <w:t xml:space="preserve"> </w:t>
+      </w:r>
+      <w:r>
+        <w:t xml:space="preserve">da CBO, e o encaminhará à FECORI no prazo de 30 (trinta) dias, conforme item 40.2 da ROP.</w:t>
+      </w:r>
+    </w:p>
+    <w:p>
+      <w:pPr>
+        <w:pStyle w:val="FirstParagraph"/>
+      </w:pPr>
+      <w:r>
+        <w:rPr>
+          <w:b/>
+          <w:bCs/>
+        </w:rPr>
+        <w:t xml:space="preserve">Art. 34</w:t>
+      </w:r>
+      <w:r>
+        <w:t xml:space="preserve"> </w:t>
+      </w:r>
+      <w:r>
+        <w:t xml:space="preserve">– A classificação individual geral será o somatório de todos os pontos obtidos (em todas as etapas/percursos),</w:t>
+      </w:r>
+      <w:r>
+        <w:t xml:space="preserve"> </w:t>
+      </w:r>
+      <w:r>
+        <w:rPr>
+          <w:b/>
+          <w:bCs/>
+        </w:rPr>
+        <w:t xml:space="preserve">sem descartes</w:t>
+      </w:r>
+      <w:r>
+        <w:t xml:space="preserve">.</w:t>
+      </w:r>
+    </w:p>
+    <w:p>
+      <w:pPr>
+        <w:pStyle w:val="Textoembloco"/>
+      </w:pPr>
+      <w:r>
+        <w:rPr>
+          <w:b/>
+          <w:bCs/>
+        </w:rPr>
+        <w:t xml:space="preserve">Parágrafo Único:</w:t>
+      </w:r>
+      <w:r>
+        <w:t xml:space="preserve"> </w:t>
+      </w:r>
+      <w:r>
+        <w:t xml:space="preserve">Em caso de empate individual, prevalece o melhor resultado no último percurso. Persistindo o empate, considerar-se-á o percurso anterior, e assim sucessivamente. Persistindo o empate, o atleta com maior idade fica melhor classificado.</w:t>
+      </w:r>
+    </w:p>
+    <w:p>
+      <w:pPr>
+        <w:pStyle w:val="FirstParagraph"/>
+      </w:pPr>
+      <w:r>
+        <w:rPr>
+          <w:b/>
+          <w:bCs/>
+        </w:rPr>
+        <w:t xml:space="preserve">Art. 35</w:t>
+      </w:r>
+      <w:r>
+        <w:t xml:space="preserve"> </w:t>
+      </w:r>
+      <w:r>
+        <w:t xml:space="preserve">– A pontuação dos clubes (em ambas as competições) será dada pela soma dos pontos dos seus</w:t>
+      </w:r>
+      <w:r>
+        <w:t xml:space="preserve"> </w:t>
+      </w:r>
+      <w:r>
+        <w:rPr>
+          <w:b/>
+          <w:bCs/>
+        </w:rPr>
+        <w:t xml:space="preserve">três atletas filiados melhores classificados em cada categoria</w:t>
+      </w:r>
+      <w:r>
+        <w:t xml:space="preserve">, por etapa/percurso. Clubes não filiados não participam do resultado de clubes.</w:t>
+      </w:r>
+    </w:p>
+    <w:p>
+      <w:pPr>
+        <w:pStyle w:val="Textoembloco"/>
+      </w:pPr>
+      <w:r>
+        <w:rPr>
+          <w:b/>
+          <w:bCs/>
+        </w:rPr>
+        <w:t xml:space="preserve">Parágrafo Único:</w:t>
+      </w:r>
+      <w:r>
+        <w:t xml:space="preserve"> </w:t>
+      </w:r>
+      <w:r>
+        <w:t xml:space="preserve">Em caso de empate entre clubes, vence o que tiver mais primeiros lugares, depois segundos, sucessivamente até o desempate.</w:t>
       </w:r>
     </w:p>
     <w:bookmarkEnd w:id="27"/>
+    <w:bookmarkStart w:id="28" w:name="da-premiação"/>
+    <w:p>
+      <w:pPr>
+        <w:pStyle w:val="Ttulo2"/>
+      </w:pPr>
+      <w:r>
+        <w:t xml:space="preserve">9. Da Premiação</w:t>
+      </w:r>
+    </w:p>
+    <w:p>
+      <w:pPr>
+        <w:pStyle w:val="FirstParagraph"/>
+      </w:pPr>
+      <w:r>
+        <w:rPr>
+          <w:b/>
+          <w:bCs/>
+        </w:rPr>
+        <w:t xml:space="preserve">Art. 36</w:t>
+      </w:r>
+      <w:r>
+        <w:t xml:space="preserve"> </w:t>
+      </w:r>
+      <w:r>
+        <w:t xml:space="preserve">– Não haverá premiação por etapa/percurso, ocorrendo apenas no final de cada campeonato.</w:t>
+      </w:r>
+    </w:p>
+    <w:p>
+      <w:pPr>
+        <w:pStyle w:val="Corpodetexto"/>
+      </w:pPr>
+      <w:r>
+        <w:rPr>
+          <w:b/>
+          <w:bCs/>
+        </w:rPr>
+        <w:t xml:space="preserve">Art. 37</w:t>
+      </w:r>
+      <w:r>
+        <w:t xml:space="preserve"> </w:t>
+      </w:r>
+      <w:r>
+        <w:t xml:space="preserve">– Outros prêmios poderão ser concedidos durante o campeonato, a cargo dos organizadores das etapas ou eventos.</w:t>
+      </w:r>
+    </w:p>
+    <w:p>
+      <w:pPr>
+        <w:pStyle w:val="Corpodetexto"/>
+      </w:pPr>
+      <w:r>
+        <w:rPr>
+          <w:b/>
+          <w:bCs/>
+        </w:rPr>
+        <w:t xml:space="preserve">Art. 38</w:t>
+      </w:r>
+      <w:r>
+        <w:t xml:space="preserve"> </w:t>
+      </w:r>
+      <w:r>
+        <w:t xml:space="preserve">– Os</w:t>
+      </w:r>
+      <w:r>
+        <w:t xml:space="preserve"> </w:t>
+      </w:r>
+      <w:r>
+        <w:rPr>
+          <w:b/>
+          <w:bCs/>
+        </w:rPr>
+        <w:t xml:space="preserve">atletas</w:t>
+      </w:r>
+      <w:r>
+        <w:t xml:space="preserve"> </w:t>
+      </w:r>
+      <w:r>
+        <w:t xml:space="preserve">campeões, vice-campeões e terceiros lugares em cada categoria (incluindo Novatos) serão premiados com</w:t>
+      </w:r>
+      <w:r>
+        <w:t xml:space="preserve"> </w:t>
+      </w:r>
+      <w:r>
+        <w:rPr>
+          <w:b/>
+          <w:bCs/>
+        </w:rPr>
+        <w:t xml:space="preserve">medalhas</w:t>
+      </w:r>
+      <w:r>
+        <w:t xml:space="preserve"> </w:t>
+      </w:r>
+      <w:r>
+        <w:t xml:space="preserve">em cada campeonato.</w:t>
+      </w:r>
+    </w:p>
+    <w:p>
+      <w:pPr>
+        <w:pStyle w:val="Corpodetexto"/>
+      </w:pPr>
+      <w:r>
+        <w:rPr>
+          <w:b/>
+          <w:bCs/>
+        </w:rPr>
+        <w:t xml:space="preserve">Art. 39</w:t>
+      </w:r>
+      <w:r>
+        <w:t xml:space="preserve"> </w:t>
+      </w:r>
+      <w:r>
+        <w:t xml:space="preserve">– Os</w:t>
+      </w:r>
+      <w:r>
+        <w:t xml:space="preserve"> </w:t>
+      </w:r>
+      <w:r>
+        <w:rPr>
+          <w:b/>
+          <w:bCs/>
+        </w:rPr>
+        <w:t xml:space="preserve">3 (três) clubes melhor pontuados</w:t>
+      </w:r>
+      <w:r>
+        <w:t xml:space="preserve"> </w:t>
+      </w:r>
+      <w:r>
+        <w:t xml:space="preserve">ao final de cada campeonato serão premiados com</w:t>
+      </w:r>
+      <w:r>
+        <w:t xml:space="preserve"> </w:t>
+      </w:r>
+      <w:r>
+        <w:rPr>
+          <w:b/>
+          <w:bCs/>
+        </w:rPr>
+        <w:t xml:space="preserve">troféus</w:t>
+      </w:r>
+      <w:r>
+        <w:t xml:space="preserve">.</w:t>
+      </w:r>
+    </w:p>
+    <w:p>
+      <w:pPr>
+        <w:pStyle w:val="Textoembloco"/>
+      </w:pPr>
+      <w:r>
+        <w:rPr>
+          <w:b/>
+          <w:bCs/>
+        </w:rPr>
+        <w:t xml:space="preserve">Parágrafo 1º:</w:t>
+      </w:r>
+      <w:r>
+        <w:t xml:space="preserve"> </w:t>
+      </w:r>
+      <w:r>
+        <w:t xml:space="preserve">Têm direito à premiação final apenas atletas filiados que participarem de no mínimo metade dos percursos/etapas realizados e estiverem em situação regular com a FECORI.</w:t>
+      </w:r>
+    </w:p>
+    <w:p>
+      <w:pPr>
+        <w:pStyle w:val="Textoembloco"/>
+      </w:pPr>
+      <w:r>
+        <w:rPr>
+          <w:b/>
+          <w:bCs/>
+        </w:rPr>
+        <w:t xml:space="preserve">Parágrafo 2º:</w:t>
+      </w:r>
+      <w:r>
+        <w:t xml:space="preserve"> </w:t>
+      </w:r>
+      <w:r>
+        <w:t xml:space="preserve">Na ausência do atleta ou representante de clube na cerimônia, o prêmio poderá ser despachado com custas ressarcidas pelo recebedor.</w:t>
+      </w:r>
+    </w:p>
+    <w:p>
+      <w:pPr>
+        <w:pStyle w:val="FirstParagraph"/>
+      </w:pPr>
+      <w:r>
+        <w:rPr>
+          <w:i/>
+          <w:iCs/>
+        </w:rPr>
+        <w:t xml:space="preserve">Fortaleza/CE, 27 de abril de 2026.</w:t>
+      </w:r>
+    </w:p>
     <w:bookmarkEnd w:id="28"/>
+    <w:bookmarkEnd w:id="29"/>
     <w:sectPr>
       <w:headerReference r:id="rId8" w:type="default"/>
       <w:footerReference r:id="rId9" w:type="default"/>

</xml_diff>

<commit_message>
docs(root): adiciona workflow de atualização do repositório e regenera documentos finais
</commit_message>
<xml_diff>
--- a/Documentos/2026/regulamentoDasCompeticoesCearenses.docx
+++ b/Documentos/2026/regulamentoDasCompeticoesCearenses.docx
@@ -453,7 +453,7 @@
         <w:t xml:space="preserve"> </w:t>
       </w:r>
       <w:r>
-        <w:t xml:space="preserve">– Ambas as competições (CCO e CCOS) serão realizadas, se possível, em áreas de fácil acesso, agradáveis e com infraestrutura compatível ao número de participantes. O terreno deve ser propício à prática de orientação e o conjunto das ações dos organizadores deve ser previamente aprovado pelo árbitro do evento/etapa.</w:t>
+        <w:t xml:space="preserve">– Ambas as competições serão realizadas, se possível, em áreas de fácil acesso, agradáveis e com infraestrutura compatível ao número de participantes. O terreno deve ser propício à prática de orientação e o conjunto das ações dos organizadores deve ser previamente aprovado pelo árbitro do evento.</w:t>
       </w:r>
     </w:p>
     <w:p>
@@ -1073,13 +1073,58 @@
           <w:b/>
           <w:bCs/>
         </w:rPr>
+        <w:t xml:space="preserve">Parágrafo Único:</w:t>
+      </w:r>
+      <w:r>
+        <w:t xml:space="preserve"> </w:t>
+      </w:r>
+      <w:r>
+        <w:t xml:space="preserve">Recomenda-se que a primeira inscrição de um atleta iniciante seja em uma das categorias acompanhadas.</w:t>
+      </w:r>
+    </w:p>
+    <w:p>
+      <w:pPr>
+        <w:pStyle w:val="FirstParagraph"/>
+      </w:pPr>
+      <w:r>
+        <w:rPr>
+          <w:b/>
+          <w:bCs/>
+        </w:rPr>
+        <w:t xml:space="preserve">Art. 9º</w:t>
+      </w:r>
+      <w:r>
+        <w:t xml:space="preserve"> </w:t>
+      </w:r>
+      <w:r>
+        <w:t xml:space="preserve">– As categorias acompanhadas são categorias de apresentação do esporte. Os atletas inscritos participarão do percurso acompanhados de um atleta experiente designado pelo clube organizador da etapa, após este ter concluído seu percurso na competição ou não competir na etapa. Para estas categorias não há classificação na etapa, percurso ou no campeonato.</w:t>
+      </w:r>
+    </w:p>
+    <w:p>
+      <w:pPr>
+        <w:pStyle w:val="Textoembloco"/>
+      </w:pPr>
+      <w:r>
+        <w:rPr>
+          <w:b/>
+          <w:bCs/>
+        </w:rPr>
         <w:t xml:space="preserve">Parágrafo 1º:</w:t>
       </w:r>
       <w:r>
         <w:t xml:space="preserve"> </w:t>
       </w:r>
       <w:r>
-        <w:t xml:space="preserve">Recomenda-se que a primeira inscrição de um atleta iniciante seja em uma das categorias acompanhadas.</w:t>
+        <w:t xml:space="preserve">É facultado a cada clube oferecer um atleta experiente para acompanhar os atletas das categorias</w:t>
+      </w:r>
+      <w:r>
+        <w:t xml:space="preserve"> </w:t>
+      </w:r>
+      <w:r>
+        <w:t xml:space="preserve">“acompanhados”</w:t>
+      </w:r>
+      <w:r>
+        <w:t xml:space="preserve">.</w:t>
       </w:r>
     </w:p>
     <w:p>
@@ -1097,39 +1142,14 @@
         <w:t xml:space="preserve"> </w:t>
       </w:r>
       <w:r>
-        <w:t xml:space="preserve">As categorias</w:t>
-      </w:r>
-      <w:r>
-        <w:t xml:space="preserve"> </w:t>
-      </w:r>
-      <w:r>
-        <w:rPr>
-          <w:i/>
-          <w:iCs/>
-        </w:rPr>
-        <w:t xml:space="preserve">preO-Para</w:t>
-      </w:r>
-      <w:r>
-        <w:t xml:space="preserve"> </w:t>
-      </w:r>
-      <w:r>
-        <w:t xml:space="preserve">e</w:t>
-      </w:r>
-      <w:r>
-        <w:t xml:space="preserve"> </w:t>
-      </w:r>
-      <w:r>
-        <w:rPr>
-          <w:i/>
-          <w:iCs/>
-        </w:rPr>
-        <w:t xml:space="preserve">preO-AB</w:t>
-      </w:r>
-      <w:r>
-        <w:t xml:space="preserve"> </w:t>
-      </w:r>
-      <w:r>
-        <w:t xml:space="preserve">não são previstas nas competições de orientação cearense.</w:t>
+        <w:rPr>
+          <w:b/>
+          <w:bCs/>
+        </w:rPr>
+        <w:t xml:space="preserve">No caso exclusivo do CCOS</w:t>
+      </w:r>
+      <w:r>
+        <w:t xml:space="preserve">, os atletas das categorias acompanhadas (HN1, HN2, HN3, DN1, DN2 e DN3) somente poderão se inscrever e participar do último percurso.</w:t>
       </w:r>
     </w:p>
     <w:p>
@@ -1141,83 +1161,13 @@
           <w:b/>
           <w:bCs/>
         </w:rPr>
-        <w:t xml:space="preserve">Art. 9º</w:t>
-      </w:r>
-      <w:r>
-        <w:t xml:space="preserve"> </w:t>
-      </w:r>
-      <w:r>
-        <w:t xml:space="preserve">– As categorias acompanhadas são categorias de apresentação do esporte. Os atletas inscritos participarão do percurso acompanhados de um atleta experiente designado pelo clube organizador da etapa, após este ter concluído seu percurso na competição ou não competir na etapa. Para estas categorias não há classificação na etapa, percurso ou no campeonato.</w:t>
-      </w:r>
-    </w:p>
-    <w:p>
-      <w:pPr>
-        <w:pStyle w:val="Textoembloco"/>
-      </w:pPr>
-      <w:r>
-        <w:rPr>
-          <w:b/>
-          <w:bCs/>
-        </w:rPr>
-        <w:t xml:space="preserve">Parágrafo 1º:</w:t>
-      </w:r>
-      <w:r>
-        <w:t xml:space="preserve"> </w:t>
-      </w:r>
-      <w:r>
-        <w:t xml:space="preserve">É facultado a cada clube oferecer um atleta experiente para acompanhar os atletas das categorias</w:t>
-      </w:r>
-      <w:r>
-        <w:t xml:space="preserve"> </w:t>
-      </w:r>
-      <w:r>
-        <w:t xml:space="preserve">“acompanhados”</w:t>
-      </w:r>
-      <w:r>
-        <w:t xml:space="preserve">.</w:t>
-      </w:r>
-    </w:p>
-    <w:p>
-      <w:pPr>
-        <w:pStyle w:val="Textoembloco"/>
-      </w:pPr>
-      <w:r>
-        <w:rPr>
-          <w:b/>
-          <w:bCs/>
-        </w:rPr>
-        <w:t xml:space="preserve">Parágrafo 2º:</w:t>
-      </w:r>
-      <w:r>
-        <w:t xml:space="preserve"> </w:t>
-      </w:r>
-      <w:r>
-        <w:rPr>
-          <w:b/>
-          <w:bCs/>
-        </w:rPr>
-        <w:t xml:space="preserve">No caso exclusivo do CCOS</w:t>
-      </w:r>
-      <w:r>
-        <w:t xml:space="preserve">, os atletas das categorias acompanhadas (HN1, HN2, HN3, DN1, DN2 e DN3) somente poderão se inscrever e participar do último percurso.</w:t>
-      </w:r>
-    </w:p>
-    <w:p>
-      <w:pPr>
-        <w:pStyle w:val="FirstParagraph"/>
-      </w:pPr>
-      <w:r>
-        <w:rPr>
-          <w:b/>
-          <w:bCs/>
-        </w:rPr>
         <w:t xml:space="preserve">Art. 10</w:t>
       </w:r>
       <w:r>
         <w:t xml:space="preserve"> </w:t>
       </w:r>
       <w:r>
-        <w:t xml:space="preserve">– É obrigatório que o uniforme do atleta atenda aos requisitos do item 14.1 da ROP.</w:t>
+        <w:t xml:space="preserve">– O uniforme do atleta deve atender ao item 14 da ROP.</w:t>
       </w:r>
     </w:p>
     <w:p>
@@ -1683,7 +1633,7 @@
         <w:t xml:space="preserve"> </w:t>
       </w:r>
       <w:r>
-        <w:t xml:space="preserve">– Os atletas serão classificados individualmente, em ordem crescente de tempo de execução do percurso, dentro de sua categoria.</w:t>
+        <w:t xml:space="preserve">– A classificação individual dos atletas segue o previsto no item 19 da ROP.</w:t>
       </w:r>
     </w:p>
     <w:p>
@@ -1771,7 +1721,7 @@
         <w:t xml:space="preserve"> </w:t>
       </w:r>
       <w:r>
-        <w:t xml:space="preserve">– O atleta que não concluir ou desistir do percurso é obrigado a registrar sua passagem pela faixa de chegada ou informar ao Controlador de Chegada o mais rápido possível.</w:t>
+        <w:t xml:space="preserve">– O atleta que não concluir ou desistir do percurso é obrigado a registrar sua passagem pela faixa de chegada ou informar ao Controlador de Chegada o mais rápido possível, devendo entregar o mapa e o chip (SI-Card), conforme item 3.12 da ROP.</w:t>
       </w:r>
       <w:r>
         <w:t xml:space="preserve"> </w:t>
@@ -1821,7 +1771,7 @@
         <w:t xml:space="preserve"> </w:t>
       </w:r>
       <w:r>
-        <w:t xml:space="preserve">– Será desclassificado da etapa/percurso o atleta que:</w:t>
+        <w:t xml:space="preserve">– As causas de desclassificação são as previstas nos itens 3.9, 3.17, 3.20, 18.7, 19.9 e 23 da ROP, além de:</w:t>
       </w:r>
     </w:p>
     <w:p>
@@ -1839,277 +1789,7 @@
         <w:t xml:space="preserve"> </w:t>
       </w:r>
       <w:r>
-        <w:t xml:space="preserve">Solicitar apoio técnico a outro atleta;</w:t>
-      </w:r>
-    </w:p>
-    <w:p>
-      <w:pPr>
-        <w:pStyle w:val="Textoembloco"/>
-      </w:pPr>
-      <w:r>
-        <w:rPr>
-          <w:b/>
-          <w:bCs/>
-        </w:rPr>
-        <w:t xml:space="preserve">b.</w:t>
-      </w:r>
-      <w:r>
-        <w:t xml:space="preserve"> </w:t>
-      </w:r>
-      <w:r>
-        <w:t xml:space="preserve">Apoiar tecnicamente outro atleta;</w:t>
-      </w:r>
-    </w:p>
-    <w:p>
-      <w:pPr>
-        <w:pStyle w:val="Textoembloco"/>
-      </w:pPr>
-      <w:r>
-        <w:rPr>
-          <w:b/>
-          <w:bCs/>
-        </w:rPr>
-        <w:t xml:space="preserve">c.</w:t>
-      </w:r>
-      <w:r>
-        <w:t xml:space="preserve"> </w:t>
-      </w:r>
-      <w:r>
-        <w:t xml:space="preserve">Concluir o percurso em ordem diferente à prescrita no mapa/cartão de controle utilizado;</w:t>
-      </w:r>
-    </w:p>
-    <w:p>
-      <w:pPr>
-        <w:pStyle w:val="Textoembloco"/>
-      </w:pPr>
-      <w:r>
-        <w:rPr>
-          <w:b/>
-          <w:bCs/>
-        </w:rPr>
-        <w:t xml:space="preserve">d.</w:t>
-      </w:r>
-      <w:r>
-        <w:t xml:space="preserve"> </w:t>
-      </w:r>
-      <w:r>
-        <w:t xml:space="preserve">Deixar de registrar qualquer ponto de controle descrito em seu mapa (via SI-Card ou picotador);</w:t>
-      </w:r>
-    </w:p>
-    <w:p>
-      <w:pPr>
-        <w:pStyle w:val="Textoembloco"/>
-      </w:pPr>
-      <w:r>
-        <w:rPr>
-          <w:b/>
-          <w:bCs/>
-        </w:rPr>
-        <w:t xml:space="preserve">e.</w:t>
-      </w:r>
-      <w:r>
-        <w:t xml:space="preserve"> </w:t>
-      </w:r>
-      <w:r>
-        <w:t xml:space="preserve">Não passar na faixa de chegada ou não fazer o registro do ponto de controle de chegada;</w:t>
-      </w:r>
-    </w:p>
-    <w:p>
-      <w:pPr>
-        <w:pStyle w:val="Textoembloco"/>
-      </w:pPr>
-      <w:r>
-        <w:rPr>
-          <w:b/>
-          <w:bCs/>
-        </w:rPr>
-        <w:t xml:space="preserve">f.</w:t>
-      </w:r>
-      <w:r>
-        <w:t xml:space="preserve"> </w:t>
-      </w:r>
-      <w:r>
-        <w:t xml:space="preserve">Passar na faixa de chegada sem o mapa;</w:t>
-      </w:r>
-    </w:p>
-    <w:p>
-      <w:pPr>
-        <w:pStyle w:val="Textoembloco"/>
-      </w:pPr>
-      <w:r>
-        <w:rPr>
-          <w:b/>
-          <w:bCs/>
-        </w:rPr>
-        <w:t xml:space="preserve">g.</w:t>
-      </w:r>
-      <w:r>
-        <w:t xml:space="preserve"> </w:t>
-      </w:r>
-      <w:r>
-        <w:t xml:space="preserve">Participar no lugar de outro atleta;</w:t>
-      </w:r>
-    </w:p>
-    <w:p>
-      <w:pPr>
-        <w:pStyle w:val="Textoembloco"/>
-      </w:pPr>
-      <w:r>
-        <w:rPr>
-          <w:b/>
-          <w:bCs/>
-        </w:rPr>
-        <w:t xml:space="preserve">h.</w:t>
-      </w:r>
-      <w:r>
-        <w:t xml:space="preserve"> </w:t>
-      </w:r>
-      <w:r>
-        <w:t xml:space="preserve">Ultrapassar o tempo limite para execução do percurso;</w:t>
-      </w:r>
-    </w:p>
-    <w:p>
-      <w:pPr>
-        <w:pStyle w:val="Textoembloco"/>
-      </w:pPr>
-      <w:r>
-        <w:rPr>
-          <w:b/>
-          <w:bCs/>
-        </w:rPr>
-        <w:t xml:space="preserve">i.</w:t>
-      </w:r>
-      <w:r>
-        <w:t xml:space="preserve"> </w:t>
-      </w:r>
-      <w:r>
-        <w:t xml:space="preserve">Prejudicar intencionalmente a competição ou outro atleta;</w:t>
-      </w:r>
-    </w:p>
-    <w:p>
-      <w:pPr>
-        <w:pStyle w:val="Textoembloco"/>
-      </w:pPr>
-      <w:r>
-        <w:rPr>
-          <w:b/>
-          <w:bCs/>
-        </w:rPr>
-        <w:t xml:space="preserve">j.</w:t>
-      </w:r>
-      <w:r>
-        <w:t xml:space="preserve"> </w:t>
-      </w:r>
-      <w:r>
-        <w:t xml:space="preserve">Não zelar pela propriedade onde se realiza a competição;</w:t>
-      </w:r>
-    </w:p>
-    <w:p>
-      <w:pPr>
-        <w:pStyle w:val="Textoembloco"/>
-      </w:pPr>
-      <w:r>
-        <w:rPr>
-          <w:b/>
-          <w:bCs/>
-        </w:rPr>
-        <w:t xml:space="preserve">k.</w:t>
-      </w:r>
-      <w:r>
-        <w:t xml:space="preserve"> </w:t>
-      </w:r>
-      <w:r>
-        <w:t xml:space="preserve">Contrariar as determinações dos organizadores dadas nos boletins ou briefing;</w:t>
-      </w:r>
-    </w:p>
-    <w:p>
-      <w:pPr>
-        <w:pStyle w:val="Textoembloco"/>
-      </w:pPr>
-      <w:r>
-        <w:rPr>
-          <w:b/>
-          <w:bCs/>
-        </w:rPr>
-        <w:t xml:space="preserve">l.</w:t>
-      </w:r>
-      <w:r>
-        <w:t xml:space="preserve"> </w:t>
-      </w:r>
-      <w:r>
-        <w:t xml:space="preserve">Comportar-se de maneira antidesportiva;</w:t>
-      </w:r>
-    </w:p>
-    <w:p>
-      <w:pPr>
-        <w:pStyle w:val="Textoembloco"/>
-      </w:pPr>
-      <w:r>
-        <w:rPr>
-          <w:b/>
-          <w:bCs/>
-        </w:rPr>
-        <w:t xml:space="preserve">m.</w:t>
-      </w:r>
-      <w:r>
-        <w:t xml:space="preserve"> </w:t>
-      </w:r>
-      <w:r>
-        <w:t xml:space="preserve">Não der destinação apropriada ao lixo produzido;</w:t>
-      </w:r>
-    </w:p>
-    <w:p>
-      <w:pPr>
-        <w:pStyle w:val="Textoembloco"/>
-      </w:pPr>
-      <w:r>
-        <w:rPr>
-          <w:b/>
-          <w:bCs/>
-        </w:rPr>
-        <w:t xml:space="preserve">n.</w:t>
-      </w:r>
-      <w:r>
-        <w:t xml:space="preserve"> </w:t>
-      </w:r>
-      <w:r>
-        <w:t xml:space="preserve">Não seguir os balizamentos obrigatórios do percurso;</w:t>
-      </w:r>
-    </w:p>
-    <w:p>
-      <w:pPr>
-        <w:pStyle w:val="Textoembloco"/>
-      </w:pPr>
-      <w:r>
-        <w:rPr>
-          <w:b/>
-          <w:bCs/>
-        </w:rPr>
-        <w:t xml:space="preserve">o.</w:t>
-      </w:r>
-      <w:r>
-        <w:t xml:space="preserve"> </w:t>
-      </w:r>
-      <w:r>
-        <w:t xml:space="preserve">Deixar de informar a utilização de SI-Card diferente do registrado para o competidor;</w:t>
-      </w:r>
-    </w:p>
-    <w:p>
-      <w:pPr>
-        <w:pStyle w:val="Textoembloco"/>
-      </w:pPr>
-      <w:r>
-        <w:rPr>
-          <w:b/>
-          <w:bCs/>
-        </w:rPr>
-        <w:t xml:space="preserve">p.</w:t>
-      </w:r>
-      <w:r>
-        <w:t xml:space="preserve"> </w:t>
-      </w:r>
-      <w:r>
-        <w:t xml:space="preserve">Outros motivos indicados na ROP.</w:t>
+        <w:t xml:space="preserve">Deixar de informar a utilização de SI-Card diferente do registrado para o competidor.</w:t>
       </w:r>
     </w:p>
     <w:p>
@@ -2127,55 +1807,7 @@
         <w:t xml:space="preserve"> </w:t>
       </w:r>
       <w:r>
-        <w:t xml:space="preserve">– O fluxo de contestações obedecerá à ordem:</w:t>
-      </w:r>
-      <w:r>
-        <w:t xml:space="preserve"> </w:t>
-      </w:r>
-      <w:r>
-        <w:rPr>
-          <w:b/>
-          <w:bCs/>
-        </w:rPr>
-        <w:t xml:space="preserve">Reclamação</w:t>
-      </w:r>
-      <w:r>
-        <w:t xml:space="preserve"> </w:t>
-      </w:r>
-      <w:r>
-        <w:t xml:space="preserve">(junto à Organização/Diretor), seguida de</w:t>
-      </w:r>
-      <w:r>
-        <w:t xml:space="preserve"> </w:t>
-      </w:r>
-      <w:r>
-        <w:rPr>
-          <w:b/>
-          <w:bCs/>
-        </w:rPr>
-        <w:t xml:space="preserve">Protesto</w:t>
-      </w:r>
-      <w:r>
-        <w:t xml:space="preserve"> </w:t>
-      </w:r>
-      <w:r>
-        <w:t xml:space="preserve">(junto ao Árbitro) e, em última instância,</w:t>
-      </w:r>
-      <w:r>
-        <w:t xml:space="preserve"> </w:t>
-      </w:r>
-      <w:r>
-        <w:rPr>
-          <w:b/>
-          <w:bCs/>
-        </w:rPr>
-        <w:t xml:space="preserve">Apelação</w:t>
-      </w:r>
-      <w:r>
-        <w:t xml:space="preserve"> </w:t>
-      </w:r>
-      <w:r>
-        <w:t xml:space="preserve">(junto ao Júri Técnico). Todos devem obedecer aos requisitos, taxas e prazos previstos nos itens 36, 37 e 39 da ROP, respectivamente.</w:t>
+        <w:t xml:space="preserve">– O fluxo de contestações obedece aos itens 36, 37 e 39 da ROP.</w:t>
       </w:r>
     </w:p>
     <w:p>
@@ -2924,29 +2556,19 @@
         <w:tab w:val="center" w:pos="5245"/>
         <w:tab w:val="right" w:pos="10773"/>
       </w:tabs>
-      <w:rPr>
-        <w:lang w:val="pt-BR"/>
-      </w:rPr>
     </w:pPr>
     <w:hyperlink r:id="rId1" w:history="1">
       <w:r>
         <w:rPr>
           <w:rStyle w:val="Hyperlink"/>
-          <w:lang w:val="pt-BR"/>
         </w:rPr>
         <w:t>www.fecori.org.br</w:t>
       </w:r>
     </w:hyperlink>
     <w:r>
-      <w:rPr>
-        <w:lang w:val="pt-BR"/>
-      </w:rPr>
       <w:tab/>
     </w:r>
     <w:r>
-      <w:rPr>
-        <w:lang w:val="pt-BR"/>
-      </w:rPr>
       <w:tab/>
     </w:r>
     <w:r>
@@ -2965,42 +2587,16 @@
       <w:fldChar w:fldCharType="end"/>
     </w:r>
     <w:r>
-      <w:rPr>
-        <w:lang w:val="pt-BR"/>
-      </w:rPr>
       <w:t>/</w:t>
     </w:r>
-    <w:r>
-      <w:rPr>
-        <w:lang w:val="pt-BR"/>
-      </w:rPr>
-      <w:fldChar w:fldCharType="begin"/>
-    </w:r>
-    <w:r>
-      <w:rPr>
-        <w:lang w:val="pt-BR"/>
-      </w:rPr>
-      <w:instrText xml:space="preserve"> NUMPAGES  \* Arabic  \* MERGEFORMAT </w:instrText>
-    </w:r>
-    <w:r>
-      <w:rPr>
-        <w:lang w:val="pt-BR"/>
-      </w:rPr>
-      <w:fldChar w:fldCharType="separate"/>
-    </w:r>
-    <w:r>
-      <w:rPr>
-        <w:noProof/>
-        <w:lang w:val="pt-BR"/>
-      </w:rPr>
-      <w:t>1</w:t>
-    </w:r>
-    <w:r>
-      <w:rPr>
-        <w:lang w:val="pt-BR"/>
-      </w:rPr>
-      <w:fldChar w:fldCharType="end"/>
-    </w:r>
+    <w:fldSimple w:instr=" NUMPAGES  \* Arabic  \* MERGEFORMAT ">
+      <w:r>
+        <w:rPr>
+          <w:noProof/>
+        </w:rPr>
+        <w:t>1</w:t>
+      </w:r>
+    </w:fldSimple>
   </w:p>
 </w:ftr>
 </file>
@@ -3136,7 +2732,6 @@
               <w:smallCaps/>
               <w:sz w:val="22"/>
               <w:szCs w:val="22"/>
-              <w:lang w:val="pt-BR"/>
             </w:rPr>
           </w:pPr>
           <w:r>
@@ -3147,7 +2742,6 @@
               <w:smallCaps/>
               <w:sz w:val="22"/>
               <w:szCs w:val="22"/>
-              <w:lang w:val="pt-BR"/>
             </w:rPr>
             <w:t>Federação Cearense de Orientação</w:t>
           </w:r>
@@ -3162,7 +2756,6 @@
               <w:iCs/>
               <w:sz w:val="16"/>
               <w:szCs w:val="16"/>
-              <w:lang w:val="pt-BR"/>
             </w:rPr>
           </w:pPr>
           <w:r>
@@ -3172,7 +2765,6 @@
               <w:iCs/>
               <w:sz w:val="16"/>
               <w:szCs w:val="16"/>
-              <w:lang w:val="pt-BR"/>
             </w:rPr>
             <w:t>Fundada em 23 de dezembro de 2004 e filiada à Confederação Brasileira de Orientação, sob o CNPJ: 07.360.881/0001-09</w:t>
           </w:r>
@@ -3732,6 +3324,9 @@
   <w:style w:default="1" w:styleId="Normal" w:type="paragraph">
     <w:name w:val="Normal"/>
     <w:qFormat/>
+    <w:rPr>
+      <w:lang w:val="pt-BR"/>
+    </w:rPr>
   </w:style>
   <w:style w:styleId="Ttulo1" w:type="paragraph">
     <w:name w:val="heading 1"/>

</xml_diff>

<commit_message>
docs(regulamento): remove restrição estadual para premiação e pontuação de clubes
</commit_message>
<xml_diff>
--- a/Documentos/2026/regulamentoDasCompeticoesCearenses.docx
+++ b/Documentos/2026/regulamentoDasCompeticoesCearenses.docx
@@ -1461,7 +1461,7 @@
         <w:t xml:space="preserve"> </w:t>
       </w:r>
       <w:r>
-        <w:t xml:space="preserve">Para pessoas não filiadas, estas devem se inscrever no percurso aberto, acompanhado, novato ou bravo. Inscrições de percurso aberto podem ser feitas no local, se houver disponibilidade.</w:t>
+        <w:t xml:space="preserve">Para pessoas iniciantes, devem se inscrever no percurso acompanhado ou novato. Pessoas não filiadas à CBO podem se inscrever no percurso acompanhado, aberto, novato ou bravo.</w:t>
       </w:r>
     </w:p>
     <w:p>
@@ -2307,10 +2307,10 @@
           <w:b/>
           <w:bCs/>
         </w:rPr>
-        <w:t xml:space="preserve">três atletas filiados melhores classificados em cada categoria</w:t>
-      </w:r>
-      <w:r>
-        <w:t xml:space="preserve">, por etapa/percurso. Clubes não filiados não participam do resultado de clubes.</w:t>
+        <w:t xml:space="preserve">três atletas filiados à CBO melhores classificados em cada categoria</w:t>
+      </w:r>
+      <w:r>
+        <w:t xml:space="preserve">, por etapa/percurso. Clubes não filiados à CBO não participam do resultado de clubes.</w:t>
       </w:r>
     </w:p>
     <w:p>
@@ -2489,7 +2489,7 @@
         <w:t xml:space="preserve"> </w:t>
       </w:r>
       <w:r>
-        <w:t xml:space="preserve">Têm direito à premiação final apenas atletas filiados que participarem de no mínimo metade dos percursos/etapas realizados e estiverem em situação regular com a FECORI.</w:t>
+        <w:t xml:space="preserve">Têm direito à premiação final apenas atletas filiados à CBO que participarem de no mínimo metade dos percursos/etapas realizados e estiverem em situação regular.</w:t>
       </w:r>
     </w:p>
     <w:p>

</xml_diff>

<commit_message>
spec(cco): reintroduz regra de descarte para campeonatos maiores e adiciona SDD
</commit_message>
<xml_diff>
--- a/Documentos/2026/regulamentoDasCompeticoesCearenses.docx
+++ b/Documentos/2026/regulamentoDasCompeticoesCearenses.docx
@@ -1142,14 +1142,98 @@
         <w:t xml:space="preserve"> </w:t>
       </w:r>
       <w:r>
-        <w:rPr>
-          <w:b/>
-          <w:bCs/>
-        </w:rPr>
-        <w:t xml:space="preserve">No caso exclusivo do CCOS</w:t>
-      </w:r>
-      <w:r>
-        <w:t xml:space="preserve">, os atletas das categorias acompanhadas (HN1, HN2, HN3, DN1, DN2 e DN3) somente poderão se inscrever e participar do último percurso.</w:t>
+        <w:t xml:space="preserve">No caso exclusivo do</w:t>
+      </w:r>
+      <w:r>
+        <w:t xml:space="preserve"> </w:t>
+      </w:r>
+      <w:r>
+        <w:rPr>
+          <w:b/>
+          <w:bCs/>
+        </w:rPr>
+        <w:t xml:space="preserve">CCOS</w:t>
+      </w:r>
+      <w:r>
+        <w:t xml:space="preserve">, atletas das categorias acompanhadas (</w:t>
+      </w:r>
+      <w:r>
+        <w:rPr>
+          <w:i/>
+          <w:iCs/>
+        </w:rPr>
+        <w:t xml:space="preserve">HN1</w:t>
+      </w:r>
+      <w:r>
+        <w:t xml:space="preserve">,</w:t>
+      </w:r>
+      <w:r>
+        <w:t xml:space="preserve"> </w:t>
+      </w:r>
+      <w:r>
+        <w:rPr>
+          <w:i/>
+          <w:iCs/>
+        </w:rPr>
+        <w:t xml:space="preserve">HN2</w:t>
+      </w:r>
+      <w:r>
+        <w:t xml:space="preserve">,</w:t>
+      </w:r>
+      <w:r>
+        <w:t xml:space="preserve"> </w:t>
+      </w:r>
+      <w:r>
+        <w:rPr>
+          <w:i/>
+          <w:iCs/>
+        </w:rPr>
+        <w:t xml:space="preserve">HN3</w:t>
+      </w:r>
+      <w:r>
+        <w:t xml:space="preserve">,</w:t>
+      </w:r>
+      <w:r>
+        <w:t xml:space="preserve"> </w:t>
+      </w:r>
+      <w:r>
+        <w:rPr>
+          <w:i/>
+          <w:iCs/>
+        </w:rPr>
+        <w:t xml:space="preserve">DN1</w:t>
+      </w:r>
+      <w:r>
+        <w:t xml:space="preserve">,</w:t>
+      </w:r>
+      <w:r>
+        <w:t xml:space="preserve"> </w:t>
+      </w:r>
+      <w:r>
+        <w:rPr>
+          <w:i/>
+          <w:iCs/>
+        </w:rPr>
+        <w:t xml:space="preserve">DN2</w:t>
+      </w:r>
+      <w:r>
+        <w:t xml:space="preserve"> </w:t>
+      </w:r>
+      <w:r>
+        <w:t xml:space="preserve">e</w:t>
+      </w:r>
+      <w:r>
+        <w:t xml:space="preserve"> </w:t>
+      </w:r>
+      <w:r>
+        <w:rPr>
+          <w:i/>
+          <w:iCs/>
+        </w:rPr>
+        <w:t xml:space="preserve">DN3</w:t>
+      </w:r>
+      <w:r>
+        <w:t xml:space="preserve">) só podem se inscrever e participar dos percursos diurnos.</w:t>
       </w:r>
     </w:p>
     <w:p>
@@ -1723,15 +1807,11 @@
       <w:r>
         <w:t xml:space="preserve">– O atleta que não concluir ou desistir do percurso é obrigado a registrar sua passagem pela faixa de chegada ou informar ao Controlador de Chegada o mais rápido possível, devendo entregar o mapa e o chip (SI-Card), conforme item 3.12 da ROP.</w:t>
       </w:r>
-      <w:r>
-        <w:t xml:space="preserve"> </w:t>
-      </w:r>
-      <w:r>
-        <w:t xml:space="preserve">&gt;</w:t>
-      </w:r>
-      <w:r>
-        <w:t xml:space="preserve"> </w:t>
-      </w:r>
+    </w:p>
+    <w:p>
+      <w:pPr>
+        <w:pStyle w:val="Textoembloco"/>
+      </w:pPr>
       <w:r>
         <w:rPr>
           <w:b/>
@@ -2142,79 +2222,7 @@
         <w:t xml:space="preserve"> </w:t>
       </w:r>
       <w:r>
-        <w:t xml:space="preserve">O atleta deve competir em, no mínimo, metade das etapas do campeonato anual para ter direito aos pontos. A média é calculada com base nas outras etapas.</w:t>
-      </w:r>
-    </w:p>
-    <w:p>
-      <w:pPr>
-        <w:pStyle w:val="Textoembloco"/>
-      </w:pPr>
-      <w:r>
-        <w:rPr>
-          <w:b/>
-          <w:bCs/>
-        </w:rPr>
-        <w:t xml:space="preserve">Parágrafo 2º (CCOS):</w:t>
-      </w:r>
-      <w:r>
-        <w:t xml:space="preserve"> </w:t>
-      </w:r>
-      <w:r>
-        <w:t xml:space="preserve">A média é calculada com base nos outros percursos do mesmo evento. Servirá também para definir a ordem de partida inversa no último percurso.</w:t>
-      </w:r>
-    </w:p>
-    <w:p>
-      <w:pPr>
-        <w:pStyle w:val="Textoembloco"/>
-      </w:pPr>
-      <w:r>
-        <w:rPr>
-          <w:b/>
-          <w:bCs/>
-        </w:rPr>
-        <w:t xml:space="preserve">Parágrafo 3º:</w:t>
-      </w:r>
-      <w:r>
-        <w:t xml:space="preserve"> </w:t>
-      </w:r>
-      <w:r>
-        <w:t xml:space="preserve">Qualquer atleta poderá se candidatar a participar como voluntário da organização de um evento, desde que a entidade organizadora aceite, mas só receberão a média da pontuação aqueles enquadrados neste artigo.</w:t>
-      </w:r>
-    </w:p>
-    <w:p>
-      <w:pPr>
-        <w:pStyle w:val="Textoembloco"/>
-      </w:pPr>
-      <w:r>
-        <w:rPr>
-          <w:b/>
-          <w:bCs/>
-        </w:rPr>
-        <w:t xml:space="preserve">Parágrafo 4º:</w:t>
-      </w:r>
-      <w:r>
-        <w:t xml:space="preserve"> </w:t>
-      </w:r>
-      <w:r>
-        <w:t xml:space="preserve">A lista com os voluntários que serão beneficiados com a média deve ser reportada ao árbitro e à FECORI ao término da apuração (CCOS) ou em até 15 dias (CCO).</w:t>
-      </w:r>
-    </w:p>
-    <w:p>
-      <w:pPr>
-        <w:pStyle w:val="Textoembloco"/>
-      </w:pPr>
-      <w:r>
-        <w:rPr>
-          <w:b/>
-          <w:bCs/>
-        </w:rPr>
-        <w:t xml:space="preserve">Parágrafo 5º:</w:t>
-      </w:r>
-      <w:r>
-        <w:t xml:space="preserve"> </w:t>
-      </w:r>
-      <w:r>
-        <w:t xml:space="preserve">O árbitro do evento elaborará o seu Relatório, previsto nas</w:t>
+        <w:t xml:space="preserve">O atleta precisa participar de pelo menos metade das etapas realizadas no campeonato anual —</w:t>
       </w:r>
       <w:r>
         <w:t xml:space="preserve"> </w:t>
@@ -2224,6 +2232,94 @@
           <w:i/>
           <w:iCs/>
         </w:rPr>
+        <w:t xml:space="preserve">considerando apenas as etapas que realmente aconteceram, excluindo as canceladas, e arredondando o número para baixo</w:t>
+      </w:r>
+      <w:r>
+        <w:t xml:space="preserve"> </w:t>
+      </w:r>
+      <w:r>
+        <w:t xml:space="preserve">— para ter direito à pontuação. A média é calculada com base nas etapas em que o atleta se inscreveu, exceto a etapa de voluntário, aplicando-se previamente o descarte previsto no Art. 34.</w:t>
+      </w:r>
+    </w:p>
+    <w:p>
+      <w:pPr>
+        <w:pStyle w:val="Textoembloco"/>
+      </w:pPr>
+      <w:r>
+        <w:rPr>
+          <w:b/>
+          <w:bCs/>
+        </w:rPr>
+        <w:t xml:space="preserve">Parágrafo 2º (CCOS):</w:t>
+      </w:r>
+      <w:r>
+        <w:t xml:space="preserve"> </w:t>
+      </w:r>
+      <w:r>
+        <w:t xml:space="preserve">A média é calculada com base nos outros percursos do mesmo evento. Servirá também para definir a ordem de partida inversa no último percurso.</w:t>
+      </w:r>
+    </w:p>
+    <w:p>
+      <w:pPr>
+        <w:pStyle w:val="Textoembloco"/>
+      </w:pPr>
+      <w:r>
+        <w:rPr>
+          <w:b/>
+          <w:bCs/>
+        </w:rPr>
+        <w:t xml:space="preserve">Parágrafo 3º:</w:t>
+      </w:r>
+      <w:r>
+        <w:t xml:space="preserve"> </w:t>
+      </w:r>
+      <w:r>
+        <w:t xml:space="preserve">Qualquer atleta poderá se candidatar a participar como voluntário da organização de um evento, desde que a entidade organizadora aceite, mas só receberão a média da pontuação aqueles enquadrados neste artigo.</w:t>
+      </w:r>
+    </w:p>
+    <w:p>
+      <w:pPr>
+        <w:pStyle w:val="Textoembloco"/>
+      </w:pPr>
+      <w:r>
+        <w:rPr>
+          <w:b/>
+          <w:bCs/>
+        </w:rPr>
+        <w:t xml:space="preserve">Parágrafo 4º:</w:t>
+      </w:r>
+      <w:r>
+        <w:t xml:space="preserve"> </w:t>
+      </w:r>
+      <w:r>
+        <w:t xml:space="preserve">A lista com os voluntários que serão beneficiados com a média deve ser reportada ao árbitro e à FECORI ao término da apuração (CCOS) ou em até 15 dias (CCO).</w:t>
+      </w:r>
+    </w:p>
+    <w:p>
+      <w:pPr>
+        <w:pStyle w:val="Textoembloco"/>
+      </w:pPr>
+      <w:r>
+        <w:rPr>
+          <w:b/>
+          <w:bCs/>
+        </w:rPr>
+        <w:t xml:space="preserve">Parágrafo 5º:</w:t>
+      </w:r>
+      <w:r>
+        <w:t xml:space="preserve"> </w:t>
+      </w:r>
+      <w:r>
+        <w:t xml:space="preserve">O árbitro do evento elaborará o seu Relatório, previsto nas</w:t>
+      </w:r>
+      <w:r>
+        <w:t xml:space="preserve"> </w:t>
+      </w:r>
+      <w:r>
+        <w:rPr>
+          <w:i/>
+          <w:iCs/>
+        </w:rPr>
         <w:t xml:space="preserve">DIRETRIZES PARA EVENTOS</w:t>
       </w:r>
       <w:r>
@@ -2248,20 +2344,23 @@
         <w:t xml:space="preserve"> </w:t>
       </w:r>
       <w:r>
-        <w:t xml:space="preserve">– A classificação individual geral será o somatório de todos os pontos obtidos (em todas as etapas/percursos),</w:t>
-      </w:r>
-      <w:r>
-        <w:t xml:space="preserve"> </w:t>
-      </w:r>
-      <w:r>
-        <w:rPr>
-          <w:b/>
-          <w:bCs/>
-        </w:rPr>
-        <w:t xml:space="preserve">sem descartes</w:t>
-      </w:r>
-      <w:r>
-        <w:t xml:space="preserve">.</w:t>
+        <w:t xml:space="preserve">–</w:t>
+      </w:r>
+      <w:r>
+        <w:t xml:space="preserve"> </w:t>
+      </w:r>
+      <w:r>
+        <w:rPr>
+          <w:b/>
+          <w:bCs/>
+        </w:rPr>
+        <w:t xml:space="preserve">Exclusivo do CCO:</w:t>
+      </w:r>
+      <w:r>
+        <w:t xml:space="preserve"> </w:t>
+      </w:r>
+      <w:r>
+        <w:t xml:space="preserve">A classificação individual geral será calculada com base no somatório dos pontos obtidos pelo atleta em todas as etapas, descartando-se obrigatoriamente uma etapa, aquela com a menor pontuação, desde que o campeonato tenha sido disputado em mais de três etapas.</w:t>
       </w:r>
     </w:p>
     <w:p>
@@ -2273,7 +2372,38 @@
           <w:b/>
           <w:bCs/>
         </w:rPr>
-        <w:t xml:space="preserve">Parágrafo Único:</w:t>
+        <w:t xml:space="preserve">Parágrafo 1º:</w:t>
+      </w:r>
+      <w:r>
+        <w:t xml:space="preserve"> </w:t>
+      </w:r>
+      <w:r>
+        <w:t xml:space="preserve">Caso o campeonato,</w:t>
+      </w:r>
+      <w:r>
+        <w:t xml:space="preserve"> </w:t>
+      </w:r>
+      <w:r>
+        <w:rPr>
+          <w:b/>
+          <w:bCs/>
+        </w:rPr>
+        <w:t xml:space="preserve">inclusive por motivo de cancelamento de etapas pela organização</w:t>
+      </w:r>
+      <w:r>
+        <w:t xml:space="preserve">, venha a ser disputado em três etapas ou menos, não haverá descarte e a classificação será dada pelo somatório de todas as etapas efetivamente realizadas.</w:t>
+      </w:r>
+    </w:p>
+    <w:p>
+      <w:pPr>
+        <w:pStyle w:val="Textoembloco"/>
+      </w:pPr>
+      <w:r>
+        <w:rPr>
+          <w:b/>
+          <w:bCs/>
+        </w:rPr>
+        <w:t xml:space="preserve">Parágrafo 2º:</w:t>
       </w:r>
       <w:r>
         <w:t xml:space="preserve"> </w:t>

</xml_diff>

<commit_message>
feat(docs): atualiza árbitros das etapas 1 e 2 do CCO XIX e regenera documentos finais
</commit_message>
<xml_diff>
--- a/Documentos/2026/regulamentoDasCompeticoesCearenses.docx
+++ b/Documentos/2026/regulamentoDasCompeticoesCearenses.docx
@@ -5,7 +5,6 @@
     <w:p>
       <w:pPr>
         <w:pStyle w:val="Ttulo1"/>
-        <w:jc w:val="both"/>
       </w:pPr>
       <w:bookmarkStart w:id="0" w:name="X9d2b1a7d218659fd06a36ab5598bc81824129ff"/>
       <w:r>
@@ -19,7 +18,6 @@
     <w:p>
       <w:pPr>
         <w:pStyle w:val="Ttulo2"/>
-        <w:jc w:val="both"/>
       </w:pPr>
       <w:bookmarkStart w:id="1" w:name="disposições-gerais"/>
       <w:r>
@@ -29,7 +27,6 @@
     <w:p>
       <w:pPr>
         <w:pStyle w:val="FirstParagraph"/>
-        <w:jc w:val="both"/>
       </w:pPr>
       <w:r>
         <w:rPr>
@@ -85,7 +82,6 @@
     <w:p>
       <w:pPr>
         <w:pStyle w:val="Corpodetexto"/>
-        <w:jc w:val="both"/>
       </w:pPr>
       <w:r>
         <w:rPr>
@@ -111,7 +107,6 @@
     <w:p>
       <w:pPr>
         <w:pStyle w:val="Textoembloco"/>
-        <w:jc w:val="both"/>
       </w:pPr>
       <w:r>
         <w:rPr>
@@ -127,8 +122,6 @@
     <w:p>
       <w:pPr>
         <w:pStyle w:val="Textoembloco"/>
-        <w:ind w:left="709"/>
-        <w:jc w:val="both"/>
       </w:pPr>
       <w:r>
         <w:rPr>
@@ -144,8 +137,6 @@
     <w:p>
       <w:pPr>
         <w:pStyle w:val="Textoembloco"/>
-        <w:ind w:left="709"/>
-        <w:jc w:val="both"/>
       </w:pPr>
       <w:r>
         <w:rPr>
@@ -161,7 +152,6 @@
     <w:p>
       <w:pPr>
         <w:pStyle w:val="Textoembloco"/>
-        <w:jc w:val="both"/>
       </w:pPr>
       <w:r>
         <w:rPr>
@@ -177,7 +167,6 @@
     <w:p>
       <w:pPr>
         <w:pStyle w:val="Textoembloco"/>
-        <w:jc w:val="both"/>
       </w:pPr>
       <w:r>
         <w:rPr>
@@ -213,7 +202,6 @@
     <w:p>
       <w:pPr>
         <w:pStyle w:val="Textoembloco"/>
-        <w:jc w:val="both"/>
       </w:pPr>
       <w:r>
         <w:rPr>
@@ -239,7 +227,6 @@
     <w:p>
       <w:pPr>
         <w:pStyle w:val="Textoembloco"/>
-        <w:jc w:val="both"/>
       </w:pPr>
       <w:r>
         <w:rPr>
@@ -265,7 +252,6 @@
     <w:p>
       <w:pPr>
         <w:pStyle w:val="Ttulo2"/>
-        <w:jc w:val="both"/>
       </w:pPr>
       <w:bookmarkStart w:id="2" w:name="das-competições"/>
       <w:bookmarkEnd w:id="1"/>
@@ -276,7 +262,6 @@
     <w:p>
       <w:pPr>
         <w:pStyle w:val="FirstParagraph"/>
-        <w:jc w:val="both"/>
       </w:pPr>
       <w:r>
         <w:rPr>
@@ -302,7 +287,6 @@
     <w:p>
       <w:pPr>
         <w:pStyle w:val="Textoembloco"/>
-        <w:jc w:val="both"/>
       </w:pPr>
       <w:r>
         <w:rPr>
@@ -318,7 +302,6 @@
     <w:p>
       <w:pPr>
         <w:pStyle w:val="Textoembloco"/>
-        <w:jc w:val="both"/>
       </w:pPr>
       <w:r>
         <w:rPr>
@@ -334,7 +317,6 @@
     <w:p>
       <w:pPr>
         <w:pStyle w:val="FirstParagraph"/>
-        <w:jc w:val="both"/>
       </w:pPr>
       <w:r>
         <w:rPr>
@@ -360,7 +342,6 @@
     <w:p>
       <w:pPr>
         <w:pStyle w:val="Corpodetexto"/>
-        <w:jc w:val="both"/>
       </w:pPr>
       <w:r>
         <w:rPr>
@@ -370,33 +351,34 @@
         <w:t>Art. 5º</w:t>
       </w:r>
       <w:r>
-        <w:t xml:space="preserve"> – Ambas as competições serão realizadas, se possível, em áreas de fácil acesso, agradáveis e com infraestrutura compatível ao número de participantes. O terreno deve ser propício à prática de orientação e o conjunto das ações dos organizadores deve ser previamente aprovado pelo árbitro do evento.</w:t>
+        <w:t xml:space="preserve"> </w:t>
+      </w:r>
+      <w:r>
+        <w:t>– Ambas as competições serão realizadas, se possível, em áreas de fácil acesso, agradáveis e com infraestrutura compatível ao número de participantes. O terreno deve ser propício à prática de orientação e o conjunto das ações dos organizadores deve ser previamente aprovado pelo árbitro do evento.</w:t>
       </w:r>
     </w:p>
     <w:p>
       <w:pPr>
         <w:pStyle w:val="Corpodetexto"/>
-        <w:jc w:val="both"/>
-      </w:pPr>
-      <w:r>
-        <w:rPr>
-          <w:b/>
-          <w:bCs/>
-        </w:rPr>
+      </w:pPr>
+      <w:r>
+        <w:rPr>
+          <w:b/>
+          <w:bCs/>
+        </w:rPr>
+        <w:t>Art. 6º</w:t>
+      </w:r>
+      <w:r>
+        <w:t xml:space="preserve"> – A organização geral de cada competição é de responsabilidade de um ou mais clubes filiados à FECORI, conforme calendários abaixo:</w:t>
+      </w:r>
+    </w:p>
+    <w:p>
+      <w:pPr>
+        <w:pStyle w:val="Ttulo3"/>
+      </w:pPr>
+      <w:bookmarkStart w:id="3" w:name="Xfc7263bc551f591fd24a57a0de31d0a3e17d277"/>
+      <w:r>
         <w:lastRenderedPageBreak/>
-        <w:t>Art. 6º</w:t>
-      </w:r>
-      <w:r>
-        <w:t xml:space="preserve"> – A organização geral de cada competição é de responsabilidade de um ou mais clubes filiados à FECORI, conforme calendários abaixo:</w:t>
-      </w:r>
-    </w:p>
-    <w:p>
-      <w:pPr>
-        <w:pStyle w:val="Ttulo3"/>
-        <w:jc w:val="both"/>
-      </w:pPr>
-      <w:bookmarkStart w:id="3" w:name="Xfc7263bc551f591fd24a57a0de31d0a3e17d277"/>
-      <w:r>
         <w:t>Calendário do XIX Campeonato Cearense de Orientação (CCO XIX)</w:t>
       </w:r>
     </w:p>
@@ -425,7 +407,6 @@
           <w:p>
             <w:pPr>
               <w:pStyle w:val="Compact"/>
-              <w:jc w:val="both"/>
             </w:pPr>
             <w:r>
               <w:rPr>
@@ -443,7 +424,6 @@
           <w:p>
             <w:pPr>
               <w:pStyle w:val="Compact"/>
-              <w:jc w:val="both"/>
             </w:pPr>
             <w:r>
               <w:rPr>
@@ -461,7 +441,6 @@
           <w:p>
             <w:pPr>
               <w:pStyle w:val="Compact"/>
-              <w:jc w:val="both"/>
             </w:pPr>
             <w:r>
               <w:rPr>
@@ -479,7 +458,6 @@
           <w:p>
             <w:pPr>
               <w:pStyle w:val="Compact"/>
-              <w:jc w:val="both"/>
             </w:pPr>
             <w:r>
               <w:rPr>
@@ -499,7 +477,6 @@
           <w:p>
             <w:pPr>
               <w:pStyle w:val="Compact"/>
-              <w:jc w:val="both"/>
             </w:pPr>
             <w:r>
               <w:t>1ª</w:t>
@@ -513,7 +490,6 @@
           <w:p>
             <w:pPr>
               <w:pStyle w:val="Compact"/>
-              <w:jc w:val="both"/>
             </w:pPr>
             <w:r>
               <w:t>31/Mai</w:t>
@@ -527,7 +503,6 @@
           <w:p>
             <w:pPr>
               <w:pStyle w:val="Compact"/>
-              <w:jc w:val="both"/>
             </w:pPr>
             <w:r>
               <w:t>COqueiro</w:t>
@@ -541,10 +516,9 @@
           <w:p>
             <w:pPr>
               <w:pStyle w:val="Compact"/>
-              <w:jc w:val="both"/>
             </w:pPr>
             <w:r>
-              <w:t>??? - ??????? (QA/FECORI ??)</w:t>
+              <w:t>Jorge Saraiva de Amorim (QA/FECORI 65)</w:t>
             </w:r>
           </w:p>
         </w:tc>
@@ -557,7 +531,6 @@
           <w:p>
             <w:pPr>
               <w:pStyle w:val="Compact"/>
-              <w:jc w:val="both"/>
             </w:pPr>
             <w:r>
               <w:t>2ª</w:t>
@@ -571,7 +544,6 @@
           <w:p>
             <w:pPr>
               <w:pStyle w:val="Compact"/>
-              <w:jc w:val="both"/>
             </w:pPr>
             <w:r>
               <w:t>28/Jun</w:t>
@@ -585,7 +557,6 @@
           <w:p>
             <w:pPr>
               <w:pStyle w:val="Compact"/>
-              <w:jc w:val="both"/>
             </w:pPr>
             <w:r>
               <w:t>COFORT</w:t>
@@ -599,7 +570,60 @@
           <w:p>
             <w:pPr>
               <w:pStyle w:val="Compact"/>
-              <w:jc w:val="both"/>
+            </w:pPr>
+            <w:r>
+              <w:t>Antônio Marden Oliveira de Sousa (QA/FECORI 80)</w:t>
+            </w:r>
+          </w:p>
+        </w:tc>
+      </w:tr>
+      <w:tr>
+        <w:tc>
+          <w:tcPr>
+            <w:tcW w:w="1188" w:type="dxa"/>
+          </w:tcPr>
+          <w:p>
+            <w:pPr>
+              <w:pStyle w:val="Compact"/>
+            </w:pPr>
+            <w:r>
+              <w:t>3ª</w:t>
+            </w:r>
+          </w:p>
+        </w:tc>
+        <w:tc>
+          <w:tcPr>
+            <w:tcW w:w="1056" w:type="dxa"/>
+          </w:tcPr>
+          <w:p>
+            <w:pPr>
+              <w:pStyle w:val="Compact"/>
+            </w:pPr>
+            <w:r>
+              <w:t>30/Ago</w:t>
+            </w:r>
+          </w:p>
+        </w:tc>
+        <w:tc>
+          <w:tcPr>
+            <w:tcW w:w="1980" w:type="dxa"/>
+          </w:tcPr>
+          <w:p>
+            <w:pPr>
+              <w:pStyle w:val="Compact"/>
+            </w:pPr>
+            <w:r>
+              <w:t>???</w:t>
+            </w:r>
+          </w:p>
+        </w:tc>
+        <w:tc>
+          <w:tcPr>
+            <w:tcW w:w="3696" w:type="dxa"/>
+          </w:tcPr>
+          <w:p>
+            <w:pPr>
+              <w:pStyle w:val="Compact"/>
             </w:pPr>
             <w:r>
               <w:t>??? – ??????? (QA/FECORI ??)</w:t>
@@ -615,10 +639,9 @@
           <w:p>
             <w:pPr>
               <w:pStyle w:val="Compact"/>
-              <w:jc w:val="both"/>
             </w:pPr>
             <w:r>
-              <w:t>3ª</w:t>
+              <w:t>4ª</w:t>
             </w:r>
           </w:p>
         </w:tc>
@@ -629,10 +652,9 @@
           <w:p>
             <w:pPr>
               <w:pStyle w:val="Compact"/>
-              <w:jc w:val="both"/>
             </w:pPr>
             <w:r>
-              <w:t>30/Ago</w:t>
+              <w:t>08/Nov</w:t>
             </w:r>
           </w:p>
         </w:tc>
@@ -643,7 +665,6 @@
           <w:p>
             <w:pPr>
               <w:pStyle w:val="Compact"/>
-              <w:jc w:val="both"/>
             </w:pPr>
             <w:r>
               <w:t>???</w:t>
@@ -657,65 +678,6 @@
           <w:p>
             <w:pPr>
               <w:pStyle w:val="Compact"/>
-              <w:jc w:val="both"/>
-            </w:pPr>
-            <w:r>
-              <w:t>??? – ??????? (QA/FECORI ??)</w:t>
-            </w:r>
-          </w:p>
-        </w:tc>
-      </w:tr>
-      <w:tr>
-        <w:tc>
-          <w:tcPr>
-            <w:tcW w:w="1188" w:type="dxa"/>
-          </w:tcPr>
-          <w:p>
-            <w:pPr>
-              <w:pStyle w:val="Compact"/>
-              <w:jc w:val="both"/>
-            </w:pPr>
-            <w:r>
-              <w:t>4ª</w:t>
-            </w:r>
-          </w:p>
-        </w:tc>
-        <w:tc>
-          <w:tcPr>
-            <w:tcW w:w="1056" w:type="dxa"/>
-          </w:tcPr>
-          <w:p>
-            <w:pPr>
-              <w:pStyle w:val="Compact"/>
-              <w:jc w:val="both"/>
-            </w:pPr>
-            <w:r>
-              <w:t>08/Nov</w:t>
-            </w:r>
-          </w:p>
-        </w:tc>
-        <w:tc>
-          <w:tcPr>
-            <w:tcW w:w="1980" w:type="dxa"/>
-          </w:tcPr>
-          <w:p>
-            <w:pPr>
-              <w:pStyle w:val="Compact"/>
-              <w:jc w:val="both"/>
-            </w:pPr>
-            <w:r>
-              <w:t>???</w:t>
-            </w:r>
-          </w:p>
-        </w:tc>
-        <w:tc>
-          <w:tcPr>
-            <w:tcW w:w="3696" w:type="dxa"/>
-          </w:tcPr>
-          <w:p>
-            <w:pPr>
-              <w:pStyle w:val="Compact"/>
-              <w:jc w:val="both"/>
             </w:pPr>
             <w:r>
               <w:t>??? – ??????? (QA/FECORI ??)</w:t>
@@ -727,7 +689,6 @@
     <w:p>
       <w:pPr>
         <w:pStyle w:val="Ttulo3"/>
-        <w:jc w:val="both"/>
       </w:pPr>
       <w:bookmarkStart w:id="4" w:name="Xfbdba5622b410d1ea40c17b7d68e28d162a11ba"/>
       <w:bookmarkEnd w:id="3"/>
@@ -760,7 +721,6 @@
           <w:p>
             <w:pPr>
               <w:pStyle w:val="Compact"/>
-              <w:jc w:val="both"/>
             </w:pPr>
             <w:r>
               <w:rPr>
@@ -778,7 +738,6 @@
           <w:p>
             <w:pPr>
               <w:pStyle w:val="Compact"/>
-              <w:jc w:val="both"/>
             </w:pPr>
             <w:r>
               <w:rPr>
@@ -796,7 +755,6 @@
           <w:p>
             <w:pPr>
               <w:pStyle w:val="Compact"/>
-              <w:jc w:val="both"/>
             </w:pPr>
             <w:r>
               <w:rPr>
@@ -814,7 +772,6 @@
           <w:p>
             <w:pPr>
               <w:pStyle w:val="Compact"/>
-              <w:jc w:val="both"/>
             </w:pPr>
             <w:r>
               <w:rPr>
@@ -834,7 +791,6 @@
           <w:p>
             <w:pPr>
               <w:pStyle w:val="Compact"/>
-              <w:jc w:val="both"/>
             </w:pPr>
             <w:r>
               <w:t>1º</w:t>
@@ -848,7 +804,6 @@
           <w:p>
             <w:pPr>
               <w:pStyle w:val="Compact"/>
-              <w:jc w:val="both"/>
             </w:pPr>
             <w:r>
               <w:t>26/Set</w:t>
@@ -862,7 +817,6 @@
           <w:p>
             <w:pPr>
               <w:pStyle w:val="Compact"/>
-              <w:jc w:val="both"/>
             </w:pPr>
             <w:r>
               <w:t>FECORI</w:t>
@@ -876,7 +830,6 @@
           <w:p>
             <w:pPr>
               <w:pStyle w:val="Compact"/>
-              <w:jc w:val="both"/>
             </w:pPr>
             <w:r>
               <w:t>??? - ??????? (QA/FECORI ??)</w:t>
@@ -892,7 +845,6 @@
           <w:p>
             <w:pPr>
               <w:pStyle w:val="Compact"/>
-              <w:jc w:val="both"/>
             </w:pPr>
             <w:r>
               <w:t>2º</w:t>
@@ -906,7 +858,6 @@
           <w:p>
             <w:pPr>
               <w:pStyle w:val="Compact"/>
-              <w:jc w:val="both"/>
             </w:pPr>
             <w:r>
               <w:t>27/Set</w:t>
@@ -920,7 +871,6 @@
           <w:p>
             <w:pPr>
               <w:pStyle w:val="Compact"/>
-              <w:jc w:val="both"/>
             </w:pPr>
             <w:r>
               <w:t>FECORI</w:t>
@@ -934,7 +884,6 @@
           <w:p>
             <w:pPr>
               <w:pStyle w:val="Compact"/>
-              <w:jc w:val="both"/>
             </w:pPr>
             <w:r>
               <w:t>??? - ??????? (QA/FECORI ??)</w:t>
@@ -950,7 +899,6 @@
           <w:p>
             <w:pPr>
               <w:pStyle w:val="Compact"/>
-              <w:jc w:val="both"/>
             </w:pPr>
             <w:r>
               <w:t>3º</w:t>
@@ -964,7 +912,6 @@
           <w:p>
             <w:pPr>
               <w:pStyle w:val="Compact"/>
-              <w:jc w:val="both"/>
             </w:pPr>
             <w:r>
               <w:t>27/Set</w:t>
@@ -978,7 +925,6 @@
           <w:p>
             <w:pPr>
               <w:pStyle w:val="Compact"/>
-              <w:jc w:val="both"/>
             </w:pPr>
             <w:r>
               <w:t>FECORI</w:t>
@@ -992,7 +938,6 @@
           <w:p>
             <w:pPr>
               <w:pStyle w:val="Compact"/>
-              <w:jc w:val="both"/>
             </w:pPr>
             <w:r>
               <w:t>??? - ??????? (QA/FECORI ??)</w:t>
@@ -1004,7 +949,6 @@
     <w:p>
       <w:pPr>
         <w:pStyle w:val="Textoembloco"/>
-        <w:jc w:val="both"/>
       </w:pPr>
       <w:r>
         <w:rPr>
@@ -1020,7 +964,6 @@
     <w:p>
       <w:pPr>
         <w:pStyle w:val="FirstParagraph"/>
-        <w:jc w:val="both"/>
       </w:pPr>
       <w:r>
         <w:rPr>
@@ -1056,7 +999,6 @@
     <w:p>
       <w:pPr>
         <w:pStyle w:val="Ttulo2"/>
-        <w:jc w:val="both"/>
       </w:pPr>
       <w:bookmarkStart w:id="5" w:name="das-categorias-e-uniformes"/>
       <w:bookmarkEnd w:id="2"/>
@@ -1068,7 +1010,6 @@
     <w:p>
       <w:pPr>
         <w:pStyle w:val="FirstParagraph"/>
-        <w:jc w:val="both"/>
       </w:pPr>
       <w:r>
         <w:rPr>
@@ -1084,7 +1025,6 @@
     <w:p>
       <w:pPr>
         <w:pStyle w:val="Textoembloco"/>
-        <w:jc w:val="both"/>
       </w:pPr>
       <w:r>
         <w:rPr>
@@ -1100,7 +1040,6 @@
     <w:p>
       <w:pPr>
         <w:pStyle w:val="FirstParagraph"/>
-        <w:jc w:val="both"/>
       </w:pPr>
       <w:r>
         <w:rPr>
@@ -1116,7 +1055,6 @@
     <w:p>
       <w:pPr>
         <w:pStyle w:val="Textoembloco"/>
-        <w:jc w:val="both"/>
       </w:pPr>
       <w:r>
         <w:rPr>
@@ -1132,7 +1070,6 @@
     <w:p>
       <w:pPr>
         <w:pStyle w:val="Textoembloco"/>
-        <w:jc w:val="both"/>
       </w:pPr>
       <w:r>
         <w:rPr>
@@ -1218,7 +1155,6 @@
     <w:p>
       <w:pPr>
         <w:pStyle w:val="FirstParagraph"/>
-        <w:jc w:val="both"/>
       </w:pPr>
       <w:r>
         <w:rPr>
@@ -1234,7 +1170,6 @@
     <w:p>
       <w:pPr>
         <w:pStyle w:val="Textoembloco"/>
-        <w:jc w:val="both"/>
       </w:pPr>
       <w:r>
         <w:rPr>
@@ -1244,20 +1179,21 @@
         <w:t>Parágrafo 1º:</w:t>
       </w:r>
       <w:r>
-        <w:t xml:space="preserve"> É obrigatório o uso de um número de identificação do atleta que proporcione sua visualização clara, devendo ser fixado no uniforme.</w:t>
+        <w:t xml:space="preserve"> </w:t>
+      </w:r>
+      <w:r>
+        <w:t>É obrigatório o uso de um número de identificação do atleta que proporcione sua visualização clara, devendo ser fixado no uniforme.</w:t>
       </w:r>
     </w:p>
     <w:p>
       <w:pPr>
         <w:pStyle w:val="Textoembloco"/>
-        <w:jc w:val="both"/>
-      </w:pPr>
-      <w:r>
-        <w:rPr>
-          <w:b/>
-          <w:bCs/>
-        </w:rPr>
-        <w:lastRenderedPageBreak/>
+      </w:pPr>
+      <w:r>
+        <w:rPr>
+          <w:b/>
+          <w:bCs/>
+        </w:rPr>
         <w:t>Parágrafo 2º:</w:t>
       </w:r>
       <w:r>
@@ -1277,7 +1213,6 @@
     <w:p>
       <w:pPr>
         <w:pStyle w:val="Textoembloco"/>
-        <w:jc w:val="both"/>
       </w:pPr>
       <w:r>
         <w:rPr>
@@ -1303,7 +1238,6 @@
     <w:p>
       <w:pPr>
         <w:pStyle w:val="Ttulo2"/>
-        <w:jc w:val="both"/>
       </w:pPr>
       <w:bookmarkStart w:id="6" w:name="da-inscrição-e-responsabilidades"/>
       <w:bookmarkEnd w:id="5"/>
@@ -1314,7 +1248,6 @@
     <w:p>
       <w:pPr>
         <w:pStyle w:val="FirstParagraph"/>
-        <w:jc w:val="both"/>
       </w:pPr>
       <w:r>
         <w:rPr>
@@ -1324,13 +1257,15 @@
         <w:t>Art. 11</w:t>
       </w:r>
       <w:r>
-        <w:t xml:space="preserve"> – As inscrições dos atletas devem ser realizadas no site da FECORI no evento correspondente à etapa ou competição.</w:t>
+        <w:t xml:space="preserve"> </w:t>
+      </w:r>
+      <w:r>
+        <w:t>– As inscrições dos atletas devem ser realizadas no site da FECORI no evento correspondente à etapa ou competição.</w:t>
       </w:r>
     </w:p>
     <w:p>
       <w:pPr>
         <w:pStyle w:val="Textoembloco"/>
-        <w:jc w:val="both"/>
       </w:pPr>
       <w:r>
         <w:rPr>
@@ -1346,7 +1281,6 @@
     <w:p>
       <w:pPr>
         <w:pStyle w:val="Textoembloco"/>
-        <w:jc w:val="both"/>
       </w:pPr>
       <w:r>
         <w:rPr>
@@ -1362,7 +1296,6 @@
     <w:p>
       <w:pPr>
         <w:pStyle w:val="Textoembloco"/>
-        <w:jc w:val="both"/>
       </w:pPr>
       <w:r>
         <w:rPr>
@@ -1378,7 +1311,6 @@
     <w:p>
       <w:pPr>
         <w:pStyle w:val="Textoembloco"/>
-        <w:jc w:val="both"/>
       </w:pPr>
       <w:r>
         <w:rPr>
@@ -1394,7 +1326,6 @@
     <w:p>
       <w:pPr>
         <w:pStyle w:val="Textoembloco"/>
-        <w:jc w:val="both"/>
       </w:pPr>
       <w:r>
         <w:rPr>
@@ -1410,7 +1341,6 @@
     <w:p>
       <w:pPr>
         <w:pStyle w:val="FirstParagraph"/>
-        <w:jc w:val="both"/>
       </w:pPr>
       <w:r>
         <w:rPr>
@@ -1426,7 +1356,6 @@
     <w:p>
       <w:pPr>
         <w:pStyle w:val="Textoembloco"/>
-        <w:jc w:val="both"/>
       </w:pPr>
       <w:r>
         <w:rPr>
@@ -1442,7 +1371,6 @@
     <w:p>
       <w:pPr>
         <w:pStyle w:val="Textoembloco"/>
-        <w:jc w:val="both"/>
       </w:pPr>
       <w:r>
         <w:rPr>
@@ -1458,7 +1386,6 @@
     <w:p>
       <w:pPr>
         <w:pStyle w:val="FirstParagraph"/>
-        <w:jc w:val="both"/>
       </w:pPr>
       <w:r>
         <w:rPr>
@@ -1474,7 +1401,6 @@
     <w:p>
       <w:pPr>
         <w:pStyle w:val="Textoembloco"/>
-        <w:jc w:val="both"/>
       </w:pPr>
       <w:r>
         <w:rPr>
@@ -1490,7 +1416,6 @@
     <w:p>
       <w:pPr>
         <w:pStyle w:val="Textoembloco"/>
-        <w:jc w:val="both"/>
       </w:pPr>
       <w:r>
         <w:rPr>
@@ -1506,14 +1431,12 @@
     <w:p>
       <w:pPr>
         <w:pStyle w:val="FirstParagraph"/>
-        <w:jc w:val="both"/>
-      </w:pPr>
-      <w:r>
-        <w:rPr>
-          <w:b/>
-          <w:bCs/>
-        </w:rPr>
-        <w:lastRenderedPageBreak/>
+      </w:pPr>
+      <w:r>
+        <w:rPr>
+          <w:b/>
+          <w:bCs/>
+        </w:rPr>
         <w:t>Art. 14</w:t>
       </w:r>
       <w:r>
@@ -1523,7 +1446,6 @@
     <w:p>
       <w:pPr>
         <w:pStyle w:val="Corpodetexto"/>
-        <w:jc w:val="both"/>
       </w:pPr>
       <w:r>
         <w:rPr>
@@ -1539,7 +1461,6 @@
     <w:p>
       <w:pPr>
         <w:pStyle w:val="Textoembloco"/>
-        <w:jc w:val="both"/>
       </w:pPr>
       <w:r>
         <w:rPr>
@@ -1555,7 +1476,6 @@
     <w:p>
       <w:pPr>
         <w:pStyle w:val="FirstParagraph"/>
-        <w:jc w:val="both"/>
       </w:pPr>
       <w:r>
         <w:rPr>
@@ -1571,7 +1491,6 @@
     <w:p>
       <w:pPr>
         <w:pStyle w:val="Corpodetexto"/>
-        <w:jc w:val="both"/>
       </w:pPr>
       <w:r>
         <w:rPr>
@@ -1587,7 +1506,6 @@
     <w:p>
       <w:pPr>
         <w:pStyle w:val="Ttulo2"/>
-        <w:jc w:val="both"/>
       </w:pPr>
       <w:bookmarkStart w:id="7" w:name="da-apuração-partida-e-classificação"/>
       <w:bookmarkEnd w:id="6"/>
@@ -1598,7 +1516,6 @@
     <w:p>
       <w:pPr>
         <w:pStyle w:val="FirstParagraph"/>
-        <w:jc w:val="both"/>
       </w:pPr>
       <w:r>
         <w:rPr>
@@ -1614,7 +1531,6 @@
     <w:p>
       <w:pPr>
         <w:pStyle w:val="Corpodetexto"/>
-        <w:jc w:val="both"/>
       </w:pPr>
       <w:r>
         <w:rPr>
@@ -1630,7 +1546,6 @@
     <w:p>
       <w:pPr>
         <w:pStyle w:val="Corpodetexto"/>
-        <w:jc w:val="both"/>
       </w:pPr>
       <w:r>
         <w:rPr>
@@ -1646,7 +1561,6 @@
     <w:p>
       <w:pPr>
         <w:pStyle w:val="Corpodetexto"/>
-        <w:jc w:val="both"/>
       </w:pPr>
       <w:r>
         <w:rPr>
@@ -1662,7 +1576,6 @@
     <w:p>
       <w:pPr>
         <w:pStyle w:val="Corpodetexto"/>
-        <w:jc w:val="both"/>
       </w:pPr>
       <w:r>
         <w:rPr>
@@ -1688,7 +1601,6 @@
     <w:p>
       <w:pPr>
         <w:pStyle w:val="Textoembloco"/>
-        <w:jc w:val="both"/>
       </w:pPr>
       <w:r>
         <w:rPr>
@@ -1698,13 +1610,15 @@
         <w:t>Parágrafo 1º (CCOS):</w:t>
       </w:r>
       <w:r>
-        <w:t xml:space="preserve"> A ordem de partida do primeiro e segundo percursos será por sorteio. O último percurso terá partida em ordem inversa à classificação parcial dos percursos anteriores para cada categoria.</w:t>
+        <w:t xml:space="preserve"> </w:t>
+      </w:r>
+      <w:r>
+        <w:t>A ordem de partida do primeiro e segundo percursos será por sorteio. O último percurso terá partida em ordem inversa à classificação parcial dos percursos anteriores para cada categoria.</w:t>
       </w:r>
     </w:p>
     <w:p>
       <w:pPr>
         <w:pStyle w:val="Textoembloco"/>
-        <w:jc w:val="both"/>
       </w:pPr>
       <w:r>
         <w:rPr>
@@ -1720,7 +1634,6 @@
     <w:p>
       <w:pPr>
         <w:pStyle w:val="FirstParagraph"/>
-        <w:jc w:val="both"/>
       </w:pPr>
       <w:r>
         <w:rPr>
@@ -1736,7 +1649,6 @@
     <w:p>
       <w:pPr>
         <w:pStyle w:val="Textoembloco"/>
-        <w:jc w:val="both"/>
       </w:pPr>
       <w:r>
         <w:rPr>
@@ -1752,19 +1664,16 @@
     <w:p>
       <w:pPr>
         <w:pStyle w:val="Ttulo2"/>
-        <w:jc w:val="both"/>
       </w:pPr>
       <w:bookmarkStart w:id="8" w:name="X89a63427626da8f2bc271701c70d2142ead9eb8"/>
       <w:bookmarkEnd w:id="7"/>
       <w:r>
-        <w:lastRenderedPageBreak/>
         <w:t>6. Das Infrações, Desclassificação e Júri Técnico</w:t>
       </w:r>
     </w:p>
     <w:p>
       <w:pPr>
         <w:pStyle w:val="FirstParagraph"/>
-        <w:jc w:val="both"/>
       </w:pPr>
       <w:r>
         <w:rPr>
@@ -1774,13 +1683,15 @@
         <w:t>Art. 24</w:t>
       </w:r>
       <w:r>
-        <w:t xml:space="preserve"> – As causas de desclassificação são as previstas nos itens 3.9, 3.17, 3.20, 18.7, 19.9 e 23 da ROP, além de:</w:t>
+        <w:t xml:space="preserve"> </w:t>
+      </w:r>
+      <w:r>
+        <w:t>– As causas de desclassificação são as previstas nos itens 3.9, 3.17, 3.20, 18.7, 19.9 e 23 da ROP, além de:</w:t>
       </w:r>
     </w:p>
     <w:p>
       <w:pPr>
         <w:pStyle w:val="Textoembloco"/>
-        <w:jc w:val="both"/>
       </w:pPr>
       <w:r>
         <w:rPr>
@@ -1796,7 +1707,6 @@
     <w:p>
       <w:pPr>
         <w:pStyle w:val="FirstParagraph"/>
-        <w:jc w:val="both"/>
       </w:pPr>
       <w:r>
         <w:rPr>
@@ -1812,7 +1722,6 @@
     <w:p>
       <w:pPr>
         <w:pStyle w:val="Corpodetexto"/>
-        <w:jc w:val="both"/>
       </w:pPr>
       <w:r>
         <w:rPr>
@@ -1828,7 +1737,6 @@
     <w:p>
       <w:pPr>
         <w:pStyle w:val="Textoembloco"/>
-        <w:jc w:val="both"/>
       </w:pPr>
       <w:r>
         <w:rPr>
@@ -1844,7 +1752,6 @@
     <w:p>
       <w:pPr>
         <w:pStyle w:val="FirstParagraph"/>
-        <w:jc w:val="both"/>
       </w:pPr>
       <w:r>
         <w:rPr>
@@ -1860,7 +1767,6 @@
     <w:p>
       <w:pPr>
         <w:pStyle w:val="Ttulo2"/>
-        <w:jc w:val="both"/>
       </w:pPr>
       <w:bookmarkStart w:id="9" w:name="da-segurança"/>
       <w:bookmarkEnd w:id="8"/>
@@ -1871,7 +1777,6 @@
     <w:p>
       <w:pPr>
         <w:pStyle w:val="FirstParagraph"/>
-        <w:jc w:val="both"/>
       </w:pPr>
       <w:r>
         <w:rPr>
@@ -1887,7 +1792,6 @@
     <w:p>
       <w:pPr>
         <w:pStyle w:val="Corpodetexto"/>
-        <w:jc w:val="both"/>
       </w:pPr>
       <w:r>
         <w:rPr>
@@ -1903,7 +1807,6 @@
     <w:p>
       <w:pPr>
         <w:pStyle w:val="Corpodetexto"/>
-        <w:jc w:val="both"/>
       </w:pPr>
       <w:r>
         <w:rPr>
@@ -1919,7 +1822,6 @@
     <w:p>
       <w:pPr>
         <w:pStyle w:val="Ttulo2"/>
-        <w:jc w:val="both"/>
       </w:pPr>
       <w:bookmarkStart w:id="10" w:name="da-pontuação-e-apuração-do-campeonato"/>
       <w:bookmarkEnd w:id="9"/>
@@ -1930,7 +1832,6 @@
     <w:p>
       <w:pPr>
         <w:pStyle w:val="FirstParagraph"/>
-        <w:jc w:val="both"/>
       </w:pPr>
       <w:r>
         <w:rPr>
@@ -1966,7 +1867,6 @@
     <w:p>
       <w:pPr>
         <w:pStyle w:val="Textoembloco"/>
-        <w:jc w:val="both"/>
       </w:pPr>
       <w:r>
         <w:rPr>
@@ -1982,7 +1882,6 @@
     <w:p>
       <w:pPr>
         <w:pStyle w:val="Textoembloco"/>
-        <w:jc w:val="both"/>
       </w:pPr>
       <w:r>
         <w:rPr>
@@ -1998,7 +1897,6 @@
     <w:p>
       <w:pPr>
         <w:pStyle w:val="Textoembloco"/>
-        <w:jc w:val="both"/>
       </w:pPr>
       <w:r>
         <w:rPr>
@@ -2014,7 +1912,6 @@
     <w:p>
       <w:pPr>
         <w:pStyle w:val="FirstParagraph"/>
-        <w:jc w:val="both"/>
       </w:pPr>
       <w:r>
         <w:rPr>
@@ -2030,7 +1927,6 @@
     <w:p>
       <w:pPr>
         <w:pStyle w:val="Textoembloco"/>
-        <w:jc w:val="both"/>
       </w:pPr>
       <w:r>
         <w:rPr>
@@ -2046,14 +1942,12 @@
     <w:p>
       <w:pPr>
         <w:pStyle w:val="Textoembloco"/>
-        <w:jc w:val="both"/>
-      </w:pPr>
-      <w:r>
-        <w:rPr>
-          <w:b/>
-          <w:bCs/>
-        </w:rPr>
-        <w:lastRenderedPageBreak/>
+      </w:pPr>
+      <w:r>
+        <w:rPr>
+          <w:b/>
+          <w:bCs/>
+        </w:rPr>
         <w:t>Parágrafo 2º:</w:t>
       </w:r>
       <w:r>
@@ -2063,7 +1957,6 @@
     <w:p>
       <w:pPr>
         <w:pStyle w:val="FirstParagraph"/>
-        <w:jc w:val="both"/>
       </w:pPr>
       <w:r>
         <w:rPr>
@@ -2089,7 +1982,6 @@
     <w:p>
       <w:pPr>
         <w:pStyle w:val="Textoembloco"/>
-        <w:jc w:val="both"/>
       </w:pPr>
       <w:r>
         <w:rPr>
@@ -2115,7 +2007,6 @@
     <w:p>
       <w:pPr>
         <w:pStyle w:val="Textoembloco"/>
-        <w:jc w:val="both"/>
       </w:pPr>
       <w:r>
         <w:rPr>
@@ -2131,7 +2022,6 @@
     <w:p>
       <w:pPr>
         <w:pStyle w:val="Textoembloco"/>
-        <w:jc w:val="both"/>
       </w:pPr>
       <w:r>
         <w:rPr>
@@ -2147,7 +2037,6 @@
     <w:p>
       <w:pPr>
         <w:pStyle w:val="Textoembloco"/>
-        <w:jc w:val="both"/>
       </w:pPr>
       <w:r>
         <w:rPr>
@@ -2163,7 +2052,6 @@
     <w:p>
       <w:pPr>
         <w:pStyle w:val="Textoembloco"/>
-        <w:jc w:val="both"/>
       </w:pPr>
       <w:r>
         <w:rPr>
@@ -2189,7 +2077,6 @@
     <w:p>
       <w:pPr>
         <w:pStyle w:val="FirstParagraph"/>
-        <w:jc w:val="both"/>
       </w:pPr>
       <w:r>
         <w:rPr>
@@ -2209,13 +2096,15 @@
         <w:t>Exclusivo do CCO:</w:t>
       </w:r>
       <w:r>
-        <w:t xml:space="preserve"> A classificação individual geral será calculada com base no somatório dos pontos obtidos pelo atleta em todas as etapas, descartando-se obrigatoriamente uma etapa, aquela com a menor pontuação, desde que o campeonato tenha sido disputado em mais de três etapas.</w:t>
+        <w:t xml:space="preserve"> </w:t>
+      </w:r>
+      <w:r>
+        <w:t>A classificação individual geral será calculada com base no somatório dos pontos obtidos pelo atleta em todas as etapas, descartando-se obrigatoriamente uma etapa, aquela com a menor pontuação, desde que o campeonato tenha sido disputado em mais de três etapas.</w:t>
       </w:r>
     </w:p>
     <w:p>
       <w:pPr>
         <w:pStyle w:val="Textoembloco"/>
-        <w:jc w:val="both"/>
       </w:pPr>
       <w:r>
         <w:rPr>
@@ -2241,7 +2130,6 @@
     <w:p>
       <w:pPr>
         <w:pStyle w:val="Textoembloco"/>
-        <w:jc w:val="both"/>
       </w:pPr>
       <w:r>
         <w:rPr>
@@ -2251,13 +2139,15 @@
         <w:t>Parágrafo 2º:</w:t>
       </w:r>
       <w:r>
-        <w:t xml:space="preserve"> Em caso de empate individual, prevalece o melhor resultado no último percurso. Persistindo o empate, considerar-se-á o percurso anterior, e assim sucessivamente. Persistindo o empate, o atleta com maior idade fica melhor classificado.</w:t>
+        <w:t xml:space="preserve"> </w:t>
+      </w:r>
+      <w:r>
+        <w:t>Em caso de empate individual, prevalece o melhor resultado no último percurso. Persistindo o empate, considerar-se-á o percurso anterior, e assim sucessivamente. Persistindo o empate, o atleta com maior idade fica melhor classificado.</w:t>
       </w:r>
     </w:p>
     <w:p>
       <w:pPr>
         <w:pStyle w:val="FirstParagraph"/>
-        <w:jc w:val="both"/>
       </w:pPr>
       <w:r>
         <w:rPr>
@@ -2283,7 +2173,6 @@
     <w:p>
       <w:pPr>
         <w:pStyle w:val="Textoembloco"/>
-        <w:jc w:val="both"/>
       </w:pPr>
       <w:r>
         <w:rPr>
@@ -2299,7 +2188,6 @@
     <w:p>
       <w:pPr>
         <w:pStyle w:val="Ttulo2"/>
-        <w:jc w:val="both"/>
       </w:pPr>
       <w:bookmarkStart w:id="11" w:name="da-premiação"/>
       <w:bookmarkEnd w:id="10"/>
@@ -2310,7 +2198,6 @@
     <w:p>
       <w:pPr>
         <w:pStyle w:val="FirstParagraph"/>
-        <w:jc w:val="both"/>
       </w:pPr>
       <w:r>
         <w:rPr>
@@ -2326,14 +2213,12 @@
     <w:p>
       <w:pPr>
         <w:pStyle w:val="Corpodetexto"/>
-        <w:jc w:val="both"/>
-      </w:pPr>
-      <w:r>
-        <w:rPr>
-          <w:b/>
-          <w:bCs/>
-        </w:rPr>
-        <w:lastRenderedPageBreak/>
+      </w:pPr>
+      <w:r>
+        <w:rPr>
+          <w:b/>
+          <w:bCs/>
+        </w:rPr>
         <w:t>Art. 37</w:t>
       </w:r>
       <w:r>
@@ -2343,7 +2228,6 @@
     <w:p>
       <w:pPr>
         <w:pStyle w:val="Corpodetexto"/>
-        <w:jc w:val="both"/>
       </w:pPr>
       <w:r>
         <w:rPr>
@@ -2379,7 +2263,6 @@
     <w:p>
       <w:pPr>
         <w:pStyle w:val="Corpodetexto"/>
-        <w:jc w:val="both"/>
       </w:pPr>
       <w:r>
         <w:rPr>
@@ -2415,7 +2298,6 @@
     <w:p>
       <w:pPr>
         <w:pStyle w:val="Textoembloco"/>
-        <w:jc w:val="both"/>
       </w:pPr>
       <w:r>
         <w:rPr>
@@ -2431,7 +2313,6 @@
     <w:p>
       <w:pPr>
         <w:pStyle w:val="Textoembloco"/>
-        <w:jc w:val="both"/>
       </w:pPr>
       <w:r>
         <w:rPr>
@@ -2447,7 +2328,6 @@
     <w:p>
       <w:pPr>
         <w:pStyle w:val="FirstParagraph"/>
-        <w:jc w:val="both"/>
       </w:pPr>
       <w:r>
         <w:rPr>
@@ -2466,7 +2346,7 @@
         <w:numRestart w:val="eachSect"/>
       </w:footnotePr>
       <w:pgSz w:w="11907" w:h="16840" w:code="9"/>
-      <w:pgMar w:top="2127" w:right="567" w:bottom="1418" w:left="567" w:header="851" w:footer="851" w:gutter="0"/>
+      <w:pgMar w:top="1701" w:right="567" w:bottom="993" w:left="567" w:header="567" w:footer="567" w:gutter="0"/>
       <w:cols w:space="720"/>
     </w:sectPr>
   </w:body>
@@ -2509,7 +2389,6 @@
       <w:tabs>
         <w:tab w:val="clear" w:pos="4252"/>
         <w:tab w:val="clear" w:pos="8504"/>
-        <w:tab w:val="center" w:pos="5245"/>
         <w:tab w:val="right" w:pos="10773"/>
       </w:tabs>
     </w:pPr>
@@ -2521,9 +2400,6 @@
         <w:t>www.fecori.org.br</w:t>
       </w:r>
     </w:hyperlink>
-    <w:r>
-      <w:tab/>
-    </w:r>
     <w:r>
       <w:tab/>
     </w:r>
@@ -2630,10 +2506,10 @@
               <w:noProof/>
             </w:rPr>
             <w:drawing>
-              <wp:inline distT="114300" distB="114300" distL="114300" distR="114300" wp14:anchorId="71B8EB04" wp14:editId="71B8EB05">
+              <wp:inline distT="114300" distB="114300" distL="114300" distR="114300" wp14:anchorId="7A1EABA9" wp14:editId="7A1EABAA">
                 <wp:extent cx="1130400" cy="230400"/>
                 <wp:effectExtent l="0" t="0" r="0" b="0"/>
-                <wp:docPr id="2056914862" name="image2.png"/>
+                <wp:docPr id="869517583" name="image2.png"/>
                 <wp:cNvGraphicFramePr/>
                 <a:graphic xmlns:a="http://schemas.openxmlformats.org/drawingml/2006/main">
                   <a:graphicData uri="http://schemas.openxmlformats.org/drawingml/2006/picture">
@@ -2766,10 +2642,10 @@
               <w:noProof/>
             </w:rPr>
             <w:drawing>
-              <wp:inline distT="0" distB="0" distL="0" distR="0" wp14:anchorId="71B8EB06" wp14:editId="71B8EB07">
+              <wp:inline distT="0" distB="0" distL="0" distR="0" wp14:anchorId="7A1EABAB" wp14:editId="7A1EABAC">
                 <wp:extent cx="808990" cy="474345"/>
                 <wp:effectExtent l="0" t="0" r="0" b="1905"/>
-                <wp:docPr id="1816387719" name="Imagem 1" descr="Orientação - O que é?"/>
+                <wp:docPr id="2088517251" name="Imagem 1" descr="Orientação - O que é?"/>
                 <wp:cNvGraphicFramePr>
                   <a:graphicFrameLocks xmlns:a="http://schemas.openxmlformats.org/drawingml/2006/main" noChangeAspect="1"/>
                 </wp:cNvGraphicFramePr>
@@ -2836,7 +2712,7 @@
   <w:abstractNum w:abstractNumId="0" w15:restartNumberingAfterBreak="0">
     <w:nsid w:val="0000A990"/>
     <w:multiLevelType w:val="multilevel"/>
-    <w:tmpl w:val="148A3584"/>
+    <w:tmpl w:val="2570BEB8"/>
     <w:lvl w:ilvl="0">
       <w:numFmt w:val="bullet"/>
       <w:lvlText w:val=" "/>
@@ -3017,7 +2893,7 @@
   <w:num w:numId="1" w16cid:durableId="1217203207">
     <w:abstractNumId w:val="1"/>
   </w:num>
-  <w:num w:numId="2" w16cid:durableId="1858696950">
+  <w:num w:numId="2" w16cid:durableId="1421869068">
     <w:abstractNumId w:val="0"/>
   </w:num>
 </w:numbering>

</xml_diff>

<commit_message>
docs(root): atualiza nomes e registros de árbitros e sincroniza documentos 2018/2026
</commit_message>
<xml_diff>
--- a/Documentos/2026/regulamentoDasCompeticoesCearenses.docx
+++ b/Documentos/2026/regulamentoDasCompeticoesCearenses.docx
@@ -699,7 +699,7 @@
               <w:jc w:val="left"/>
             </w:pPr>
             <w:r>
-              <w:t xml:space="preserve">???</w:t>
+              <w:t xml:space="preserve">COCAP</w:t>
             </w:r>
           </w:p>
         </w:tc>
@@ -711,7 +711,7 @@
               <w:jc w:val="left"/>
             </w:pPr>
             <w:r>
-              <w:t xml:space="preserve">??? – ??????? (QA/FECORI ??)</w:t>
+              <w:t xml:space="preserve">Paulo Antônio da Costa Mazulo (QA/FECORI 54)</w:t>
             </w:r>
           </w:p>
         </w:tc>
@@ -749,7 +749,7 @@
               <w:jc w:val="left"/>
             </w:pPr>
             <w:r>
-              <w:t xml:space="preserve">???</w:t>
+              <w:t xml:space="preserve">Trilha Norte/CODL</w:t>
             </w:r>
           </w:p>
         </w:tc>
@@ -761,7 +761,7 @@
               <w:jc w:val="left"/>
             </w:pPr>
             <w:r>
-              <w:t xml:space="preserve">??? – ??????? (QA/FECORI ??)</w:t>
+              <w:t xml:space="preserve">Jayckson Saraiva de Amorim (QA/FECORI 59)</w:t>
             </w:r>
           </w:p>
         </w:tc>

</xml_diff>

<commit_message>
docs(root): atualiza árbitros do CCOS, links externos e formatação
- Define Joelson Matias da Silva (QA/FECORI 85) como árbitro do CCOS
- Atualiza link do regulamento da ROP para apontar para a S3 da CBO
- Adiciona âncoras de navegação no sumário do regrasOrientacaoPedestre.md
- Regenera os artefatos finais (.docx e .pdf) para 2026
</commit_message>
<xml_diff>
--- a/Documentos/2026/regulamentoDasCompeticoesCearenses.docx
+++ b/Documentos/2026/regulamentoDasCompeticoesCearenses.docx
@@ -2,7 +2,7 @@
 <file path=word/document.xml><?xml version="1.0" encoding="utf-8"?>
 <w:document xmlns:w="http://schemas.openxmlformats.org/wordprocessingml/2006/main" xmlns:m="http://schemas.openxmlformats.org/officeDocument/2006/math" xmlns:r="http://schemas.openxmlformats.org/officeDocument/2006/relationships" xmlns:o="urn:schemas-microsoft-com:office:office" xmlns:v="urn:schemas-microsoft-com:vml" xmlns:w10="urn:schemas-microsoft-com:office:word" xmlns:a="http://schemas.openxmlformats.org/drawingml/2006/main" xmlns:pic="http://schemas.openxmlformats.org/drawingml/2006/picture" xmlns:wp="http://schemas.openxmlformats.org/drawingml/2006/wordprocessingDrawing">
   <w:body>
-    <w:bookmarkStart w:id="30" w:name="X9d2b1a7d218659fd06a36ab5598bc81824129ff"/>
+    <w:bookmarkStart w:id="31" w:name="X9d2b1a7d218659fd06a36ab5598bc81824129ff"/>
     <w:p>
       <w:pPr>
         <w:pStyle w:val="Ttulo1"/>
@@ -15,7 +15,7 @@
         <w:t xml:space="preserve">Regulamento das Competições Cearenses de Orientação</w:t>
       </w:r>
     </w:p>
-    <w:bookmarkStart w:id="19" w:name="disposições-gerais"/>
+    <w:bookmarkStart w:id="20" w:name="disposições-gerais"/>
     <w:p>
       <w:pPr>
         <w:pStyle w:val="Ttulo2"/>
@@ -93,18 +93,16 @@
       <w:r>
         <w:t xml:space="preserve"> </w:t>
       </w:r>
-      <w:r>
-        <w:rPr>
-          <w:b/>
-          <w:bCs/>
-        </w:rPr>
-        <w:t xml:space="preserve">Confederação Brasileira de Orientação</w:t>
-      </w:r>
-      <w:r>
-        <w:t xml:space="preserve"> </w:t>
-      </w:r>
-      <w:r>
-        <w:t xml:space="preserve">(CBO).</w:t>
+      <w:hyperlink r:id="rId19">
+        <w:r>
+          <w:rPr>
+            <w:rStyle w:val="Hyperlink"/>
+          </w:rPr>
+          <w:t xml:space="preserve">Confederação Brasileira de Orientação (CBO)</w:t>
+        </w:r>
+      </w:hyperlink>
+      <w:r>
+        <w:t xml:space="preserve">.</w:t>
       </w:r>
     </w:p>
     <w:p>
@@ -325,8 +323,8 @@
         <w:t xml:space="preserve">.</w:t>
       </w:r>
     </w:p>
-    <w:bookmarkEnd w:id="19"/>
-    <w:bookmarkStart w:id="22" w:name="das-competições"/>
+    <w:bookmarkEnd w:id="20"/>
+    <w:bookmarkStart w:id="23" w:name="das-competições"/>
     <w:p>
       <w:pPr>
         <w:pStyle w:val="Ttulo2"/>
@@ -475,7 +473,7 @@
         <w:t xml:space="preserve">– A organização geral de cada competição é de responsabilidade de um ou mais clubes filiados à FECORI, conforme calendários abaixo:</w:t>
       </w:r>
     </w:p>
-    <w:bookmarkStart w:id="20" w:name="Xfc7263bc551f591fd24a57a0de31d0a3e17d277"/>
+    <w:bookmarkStart w:id="21" w:name="Xfc7263bc551f591fd24a57a0de31d0a3e17d277"/>
     <w:p>
       <w:pPr>
         <w:pStyle w:val="Ttulo3"/>
@@ -767,8 +765,8 @@
         </w:tc>
       </w:tr>
     </w:tbl>
-    <w:bookmarkEnd w:id="20"/>
-    <w:bookmarkStart w:id="21" w:name="Xfbdba5622b410d1ea40c17b7d68e28d162a11ba"/>
+    <w:bookmarkEnd w:id="21"/>
+    <w:bookmarkStart w:id="22" w:name="Xfbdba5622b410d1ea40c17b7d68e28d162a11ba"/>
     <w:p>
       <w:pPr>
         <w:pStyle w:val="Ttulo3"/>
@@ -904,7 +902,7 @@
               <w:jc w:val="left"/>
             </w:pPr>
             <w:r>
-              <w:t xml:space="preserve">??? - ??????? (QA/FECORI ??)</w:t>
+              <w:t xml:space="preserve">Joelson Matias da Silva (QA/FECORI 85)</w:t>
             </w:r>
           </w:p>
         </w:tc>
@@ -954,7 +952,7 @@
               <w:jc w:val="left"/>
             </w:pPr>
             <w:r>
-              <w:t xml:space="preserve">??? - ??????? (QA/FECORI ??)</w:t>
+              <w:t xml:space="preserve">Joelson Matias da Silva (QA/FECORI 85)</w:t>
             </w:r>
           </w:p>
         </w:tc>
@@ -1004,7 +1002,7 @@
               <w:jc w:val="left"/>
             </w:pPr>
             <w:r>
-              <w:t xml:space="preserve">??? - ??????? (QA/FECORI ??)</w:t>
+              <w:t xml:space="preserve">Joelson Matias da Silva (QA/FECORI 85)</w:t>
             </w:r>
           </w:p>
         </w:tc>
@@ -1072,9 +1070,9 @@
         <w:t xml:space="preserve">, conforme itens 5.1 e 35.6 da ROP.</w:t>
       </w:r>
     </w:p>
-    <w:bookmarkEnd w:id="21"/>
     <w:bookmarkEnd w:id="22"/>
-    <w:bookmarkStart w:id="23" w:name="das-categorias-e-uniformes"/>
+    <w:bookmarkEnd w:id="23"/>
+    <w:bookmarkStart w:id="24" w:name="das-categorias-e-uniformes"/>
     <w:p>
       <w:pPr>
         <w:pStyle w:val="Ttulo2"/>
@@ -1359,8 +1357,8 @@
         <w:t xml:space="preserve">, poderão ser usados calção e camiseta cavada.</w:t>
       </w:r>
     </w:p>
-    <w:bookmarkEnd w:id="23"/>
-    <w:bookmarkStart w:id="24" w:name="da-inscrição-e-responsabilidades"/>
+    <w:bookmarkEnd w:id="24"/>
+    <w:bookmarkStart w:id="25" w:name="da-inscrição-e-responsabilidades"/>
     <w:p>
       <w:pPr>
         <w:pStyle w:val="Ttulo2"/>
@@ -1675,8 +1673,8 @@
         <w:t xml:space="preserve">– Caso o número de inscritos supere a quantidade de SI-Cards disponíveis, a prioridade será das categorias Elite, Alfa, Bravo e Novato (nesta ordem). Atletas não contemplados receberão estorno da taxa de aluguel.</w:t>
       </w:r>
     </w:p>
-    <w:bookmarkEnd w:id="24"/>
-    <w:bookmarkStart w:id="25" w:name="da-apuração-partida-e-classificação"/>
+    <w:bookmarkEnd w:id="25"/>
+    <w:bookmarkStart w:id="26" w:name="da-apuração-partida-e-classificação"/>
     <w:p>
       <w:pPr>
         <w:pStyle w:val="Ttulo2"/>
@@ -1863,8 +1861,8 @@
         <w:t xml:space="preserve">O não cumprimento desta regra gerará penalização, tornando a etapa/percurso não passível de descarte.</w:t>
       </w:r>
     </w:p>
-    <w:bookmarkEnd w:id="25"/>
-    <w:bookmarkStart w:id="26" w:name="X89a63427626da8f2bc271701c70d2142ead9eb8"/>
+    <w:bookmarkEnd w:id="26"/>
+    <w:bookmarkStart w:id="27" w:name="X89a63427626da8f2bc271701c70d2142ead9eb8"/>
     <w:p>
       <w:pPr>
         <w:pStyle w:val="Ttulo2"/>
@@ -1981,8 +1979,8 @@
         <w:t xml:space="preserve">– O objetivo, composição e prerrogativas do Júri Técnico obedecem às DIRETRIZES PARA OS JÚRIS EM EVENTOS OFICIAIS da CBO e ao item 38 da ROP.</w:t>
       </w:r>
     </w:p>
-    <w:bookmarkEnd w:id="26"/>
-    <w:bookmarkStart w:id="27" w:name="da-segurança"/>
+    <w:bookmarkEnd w:id="27"/>
+    <w:bookmarkStart w:id="28" w:name="da-segurança"/>
     <w:p>
       <w:pPr>
         <w:pStyle w:val="Ttulo2"/>
@@ -2045,8 +2043,8 @@
         <w:t xml:space="preserve">– Deverão ser ressaltados nos avisos preliminares, antes da partida da primeira bateria de atletas, bem como indicados nos mapas, os pontos que apresentam qualquer perigo ou áreas interditadas para a competição.</w:t>
       </w:r>
     </w:p>
-    <w:bookmarkEnd w:id="27"/>
-    <w:bookmarkStart w:id="28" w:name="da-pontuação-e-apuração-do-campeonato"/>
+    <w:bookmarkEnd w:id="28"/>
+    <w:bookmarkStart w:id="29" w:name="da-pontuação-e-apuração-do-campeonato"/>
     <w:p>
       <w:pPr>
         <w:pStyle w:val="Ttulo2"/>
@@ -2498,8 +2496,8 @@
         <w:t xml:space="preserve">Em caso de empate entre clubes, vence o que tiver mais primeiros lugares, depois segundos, sucessivamente até o desempate.</w:t>
       </w:r>
     </w:p>
-    <w:bookmarkEnd w:id="28"/>
-    <w:bookmarkStart w:id="29" w:name="da-premiação"/>
+    <w:bookmarkEnd w:id="29"/>
+    <w:bookmarkStart w:id="30" w:name="da-premiação"/>
     <w:p>
       <w:pPr>
         <w:pStyle w:val="Ttulo2"/>
@@ -2689,8 +2687,8 @@
         <w:t xml:space="preserve">Fortaleza/CE, 27 de abril de 2026.</w:t>
       </w:r>
     </w:p>
-    <w:bookmarkEnd w:id="29"/>
     <w:bookmarkEnd w:id="30"/>
+    <w:bookmarkEnd w:id="31"/>
     <w:sectPr>
       <w:headerReference r:id="rId8" w:type="default"/>
       <w:footerReference r:id="rId9" w:type="default"/>

</xml_diff>

<commit_message>
docs: Atualizar os títulos das competições no arquivo de regulamento e adicionar os arquivos de documentação de 2026.
</commit_message>
<xml_diff>
--- a/Documentos/2026/regulamentoDasCompeticoesCearenses.docx
+++ b/Documentos/2026/regulamentoDasCompeticoesCearenses.docx
@@ -5,13 +5,32 @@
     <w:p>
       <w:pPr>
         <w:pStyle w:val="Ttulo1"/>
-        <w:jc w:val="both"/>
+        <w:spacing w:before="240"/>
+        <w:jc w:val="center"/>
+        <w:rPr>
+          <w:smallCaps/>
+          <w:sz w:val="44"/>
+          <w:szCs w:val="44"/>
+          <w14:shadow w14:blurRad="50800" w14:dist="38100" w14:dir="2700000" w14:sx="100000" w14:sy="100000" w14:kx="0" w14:ky="0" w14:algn="tl">
+            <w14:srgbClr w14:val="000000">
+              <w14:alpha w14:val="60000"/>
+            </w14:srgbClr>
+          </w14:shadow>
+        </w:rPr>
       </w:pPr>
       <w:bookmarkStart w:id="0" w:name="X9d2b1a7d218659fd06a36ab5598bc81824129ff"/>
       <w:r>
         <w:rPr>
           <w:b/>
           <w:bCs/>
+          <w:smallCaps/>
+          <w:sz w:val="44"/>
+          <w:szCs w:val="44"/>
+          <w14:shadow w14:blurRad="50800" w14:dist="38100" w14:dir="2700000" w14:sx="100000" w14:sy="100000" w14:kx="0" w14:ky="0" w14:algn="tl">
+            <w14:srgbClr w14:val="000000">
+              <w14:alpha w14:val="60000"/>
+            </w14:srgbClr>
+          </w14:shadow>
         </w:rPr>
         <w:t>Regulamento das Competições Cearenses de Orientação</w:t>
       </w:r>
@@ -45,6 +64,12 @@
         <w:rPr>
           <w:i/>
           <w:iCs/>
+          <w:smallCaps/>
+          <w14:shadow w14:blurRad="50800" w14:dist="38100" w14:dir="2700000" w14:sx="100000" w14:sy="100000" w14:kx="0" w14:ky="0" w14:algn="tl">
+            <w14:srgbClr w14:val="000000">
+              <w14:alpha w14:val="60000"/>
+            </w14:srgbClr>
+          </w14:shadow>
         </w:rPr>
         <w:t>Campeonato Cearense de Orientação</w:t>
       </w:r>
@@ -55,6 +80,12 @@
         <w:rPr>
           <w:i/>
           <w:iCs/>
+          <w:smallCaps/>
+          <w14:shadow w14:blurRad="50800" w14:dist="38100" w14:dir="2700000" w14:sx="100000" w14:sy="100000" w14:kx="0" w14:ky="0" w14:algn="tl">
+            <w14:srgbClr w14:val="000000">
+              <w14:alpha w14:val="60000"/>
+            </w14:srgbClr>
+          </w14:shadow>
         </w:rPr>
         <w:t>Campeonato Cearense de Orientação Sprint</w:t>
       </w:r>
@@ -113,7 +144,7 @@
     <w:p>
       <w:pPr>
         <w:pStyle w:val="Textoembloco"/>
-        <w:ind w:left="284"/>
+        <w:ind w:left="284" w:right="0"/>
         <w:jc w:val="both"/>
       </w:pPr>
       <w:r>
@@ -130,7 +161,7 @@
     <w:p>
       <w:pPr>
         <w:pStyle w:val="Textoembloco"/>
-        <w:ind w:left="567"/>
+        <w:ind w:left="567" w:right="0"/>
         <w:jc w:val="both"/>
       </w:pPr>
       <w:r>
@@ -147,7 +178,7 @@
     <w:p>
       <w:pPr>
         <w:pStyle w:val="Textoembloco"/>
-        <w:ind w:left="567"/>
+        <w:ind w:left="567" w:right="0"/>
         <w:jc w:val="both"/>
       </w:pPr>
       <w:r>
@@ -164,7 +195,7 @@
     <w:p>
       <w:pPr>
         <w:pStyle w:val="Textoembloco"/>
-        <w:ind w:left="284"/>
+        <w:ind w:left="284" w:right="0"/>
         <w:jc w:val="both"/>
       </w:pPr>
       <w:r>
@@ -181,7 +212,7 @@
     <w:p>
       <w:pPr>
         <w:pStyle w:val="Textoembloco"/>
-        <w:ind w:left="284"/>
+        <w:ind w:left="284" w:right="0"/>
         <w:jc w:val="both"/>
       </w:pPr>
       <w:r>
@@ -218,7 +249,7 @@
     <w:p>
       <w:pPr>
         <w:pStyle w:val="Textoembloco"/>
-        <w:ind w:left="284"/>
+        <w:ind w:left="284" w:right="0"/>
         <w:jc w:val="both"/>
       </w:pPr>
       <w:r>
@@ -245,7 +276,7 @@
     <w:p>
       <w:pPr>
         <w:pStyle w:val="Textoembloco"/>
-        <w:ind w:left="284"/>
+        <w:ind w:left="284" w:right="0"/>
         <w:jc w:val="both"/>
       </w:pPr>
       <w:r>
@@ -309,7 +340,7 @@
     <w:p>
       <w:pPr>
         <w:pStyle w:val="Textoembloco"/>
-        <w:ind w:left="284"/>
+        <w:ind w:left="284" w:right="0"/>
         <w:jc w:val="both"/>
       </w:pPr>
       <w:r>
@@ -326,7 +357,7 @@
     <w:p>
       <w:pPr>
         <w:pStyle w:val="Textoembloco"/>
-        <w:ind w:left="284"/>
+        <w:ind w:left="284" w:right="0"/>
         <w:jc w:val="both"/>
       </w:pPr>
       <w:r>
@@ -406,7 +437,18 @@
       <w:bookmarkStart w:id="3" w:name="Xfc7263bc551f591fd24a57a0de31d0a3e17d277"/>
       <w:r>
         <w:lastRenderedPageBreak/>
-        <w:t>Calendário do XIX Campeonato Cearense de Orientação (CCO XIX)</w:t>
+        <w:t xml:space="preserve">Calendário do </w:t>
+      </w:r>
+      <w:r>
+        <w:rPr>
+          <w:smallCaps/>
+          <w14:shadow w14:blurRad="50800" w14:dist="38100" w14:dir="2700000" w14:sx="100000" w14:sy="100000" w14:kx="0" w14:ky="0" w14:algn="tl">
+            <w14:srgbClr w14:val="000000">
+              <w14:alpha w14:val="60000"/>
+            </w14:srgbClr>
+          </w14:shadow>
+        </w:rPr>
+        <w:t>XX Campeonato Cearense de Orientação</w:t>
       </w:r>
     </w:p>
     <w:tbl>
@@ -570,8 +612,13 @@
               <w:jc w:val="center"/>
             </w:pPr>
             <w:r>
-              <w:t>28/Jun</w:t>
+              <w:t>28/</w:t>
             </w:r>
+            <w:proofErr w:type="spellStart"/>
+            <w:r>
+              <w:t>Jun</w:t>
+            </w:r>
+            <w:proofErr w:type="spellEnd"/>
           </w:p>
         </w:tc>
         <w:tc>
@@ -598,7 +645,15 @@
               <w:jc w:val="both"/>
             </w:pPr>
             <w:r>
-              <w:t>Antônio Marden Oliveira de Sousa (QA/FECORI 80)</w:t>
+              <w:t xml:space="preserve">Antônio </w:t>
+            </w:r>
+            <w:proofErr w:type="spellStart"/>
+            <w:r>
+              <w:t>Marden</w:t>
+            </w:r>
+            <w:proofErr w:type="spellEnd"/>
+            <w:r>
+              <w:t xml:space="preserve"> Oliveira de Sousa (QA/FECORI 80)</w:t>
             </w:r>
           </w:p>
         </w:tc>
@@ -631,8 +686,13 @@
               <w:jc w:val="center"/>
             </w:pPr>
             <w:r>
-              <w:t>30/Ago</w:t>
+              <w:t>30/</w:t>
             </w:r>
+            <w:proofErr w:type="spellStart"/>
+            <w:r>
+              <w:t>Ago</w:t>
+            </w:r>
+            <w:proofErr w:type="spellEnd"/>
           </w:p>
         </w:tc>
         <w:tc>
@@ -659,7 +719,15 @@
               <w:jc w:val="both"/>
             </w:pPr>
             <w:r>
-              <w:t>Paulo Antônio da Costa Mazulo (QA/FECORI 54)</w:t>
+              <w:t xml:space="preserve">Paulo Antônio da Costa </w:t>
+            </w:r>
+            <w:proofErr w:type="spellStart"/>
+            <w:r>
+              <w:t>Mazulo</w:t>
+            </w:r>
+            <w:proofErr w:type="spellEnd"/>
+            <w:r>
+              <w:t xml:space="preserve"> (QA/FECORI 54)</w:t>
             </w:r>
           </w:p>
         </w:tc>
@@ -689,8 +757,13 @@
               <w:jc w:val="center"/>
             </w:pPr>
             <w:r>
-              <w:t>08/Nov</w:t>
+              <w:t>08/</w:t>
             </w:r>
+            <w:proofErr w:type="spellStart"/>
+            <w:r>
+              <w:t>Nov</w:t>
+            </w:r>
+            <w:proofErr w:type="spellEnd"/>
           </w:p>
         </w:tc>
         <w:tc>
@@ -731,7 +804,18 @@
       <w:bookmarkStart w:id="4" w:name="Xfbdba5622b410d1ea40c17b7d68e28d162a11ba"/>
       <w:bookmarkEnd w:id="3"/>
       <w:r>
-        <w:t>Calendário do XIII Campeonato Cearense de Orientação Sprint (CCOS XIII)</w:t>
+        <w:t xml:space="preserve">Calendário do </w:t>
+      </w:r>
+      <w:r>
+        <w:rPr>
+          <w:smallCaps/>
+          <w14:shadow w14:blurRad="50800" w14:dist="38100" w14:dir="2700000" w14:sx="100000" w14:sy="100000" w14:kx="0" w14:ky="0" w14:algn="tl">
+            <w14:srgbClr w14:val="000000">
+              <w14:alpha w14:val="60000"/>
+            </w14:srgbClr>
+          </w14:shadow>
+        </w:rPr>
+        <w:t>XIII Campeonato Cearense de Orientação Sprint</w:t>
       </w:r>
     </w:p>
     <w:tbl>
@@ -993,7 +1077,7 @@
     <w:p>
       <w:pPr>
         <w:pStyle w:val="Textoembloco"/>
-        <w:ind w:left="284"/>
+        <w:ind w:left="284" w:right="0"/>
         <w:jc w:val="both"/>
       </w:pPr>
       <w:r>
@@ -1074,7 +1158,7 @@
     <w:p>
       <w:pPr>
         <w:pStyle w:val="Textoembloco"/>
-        <w:ind w:left="284"/>
+        <w:ind w:left="284" w:right="0"/>
         <w:jc w:val="both"/>
       </w:pPr>
       <w:r>
@@ -1107,7 +1191,7 @@
     <w:p>
       <w:pPr>
         <w:pStyle w:val="Textoembloco"/>
-        <w:ind w:left="284"/>
+        <w:ind w:left="284" w:right="0"/>
         <w:jc w:val="both"/>
       </w:pPr>
       <w:r>
@@ -1124,7 +1208,7 @@
     <w:p>
       <w:pPr>
         <w:pStyle w:val="Textoembloco"/>
-        <w:ind w:left="284"/>
+        <w:ind w:left="284" w:right="0"/>
         <w:jc w:val="both"/>
       </w:pPr>
       <w:r>
@@ -1227,7 +1311,7 @@
     <w:p>
       <w:pPr>
         <w:pStyle w:val="Textoembloco"/>
-        <w:ind w:left="284"/>
+        <w:ind w:left="284" w:right="0"/>
         <w:jc w:val="both"/>
       </w:pPr>
       <w:r>
@@ -1244,7 +1328,7 @@
     <w:p>
       <w:pPr>
         <w:pStyle w:val="Textoembloco"/>
-        <w:ind w:left="284"/>
+        <w:ind w:left="284" w:right="0"/>
         <w:jc w:val="both"/>
       </w:pPr>
       <w:r>
@@ -1271,7 +1355,7 @@
     <w:p>
       <w:pPr>
         <w:pStyle w:val="Textoembloco"/>
-        <w:ind w:left="284"/>
+        <w:ind w:left="284" w:right="0"/>
         <w:jc w:val="both"/>
       </w:pPr>
       <w:r>
@@ -1326,7 +1410,7 @@
     <w:p>
       <w:pPr>
         <w:pStyle w:val="Textoembloco"/>
-        <w:ind w:left="284"/>
+        <w:ind w:left="284" w:right="0"/>
         <w:jc w:val="both"/>
       </w:pPr>
       <w:r>
@@ -1343,7 +1427,7 @@
     <w:p>
       <w:pPr>
         <w:pStyle w:val="Textoembloco"/>
-        <w:ind w:left="284"/>
+        <w:ind w:left="284" w:right="0"/>
         <w:jc w:val="both"/>
       </w:pPr>
       <w:r>
@@ -1360,7 +1444,7 @@
     <w:p>
       <w:pPr>
         <w:pStyle w:val="Textoembloco"/>
-        <w:ind w:left="284"/>
+        <w:ind w:left="284" w:right="0"/>
         <w:jc w:val="both"/>
       </w:pPr>
       <w:r>
@@ -1377,7 +1461,7 @@
     <w:p>
       <w:pPr>
         <w:pStyle w:val="Textoembloco"/>
-        <w:ind w:left="284"/>
+        <w:ind w:left="284" w:right="0"/>
         <w:jc w:val="both"/>
       </w:pPr>
       <w:r>
@@ -1394,7 +1478,7 @@
     <w:p>
       <w:pPr>
         <w:pStyle w:val="Textoembloco"/>
-        <w:ind w:left="284"/>
+        <w:ind w:left="284" w:right="0"/>
         <w:jc w:val="both"/>
       </w:pPr>
       <w:r>
@@ -1427,7 +1511,7 @@
     <w:p>
       <w:pPr>
         <w:pStyle w:val="Textoembloco"/>
-        <w:ind w:left="284"/>
+        <w:ind w:left="284" w:right="0"/>
         <w:jc w:val="both"/>
       </w:pPr>
       <w:r>
@@ -1444,7 +1528,7 @@
     <w:p>
       <w:pPr>
         <w:pStyle w:val="Textoembloco"/>
-        <w:ind w:left="284"/>
+        <w:ind w:left="284" w:right="0"/>
         <w:jc w:val="both"/>
       </w:pPr>
       <w:r>
@@ -1477,7 +1561,7 @@
     <w:p>
       <w:pPr>
         <w:pStyle w:val="Textoembloco"/>
-        <w:ind w:left="284"/>
+        <w:ind w:left="284" w:right="0"/>
         <w:jc w:val="both"/>
       </w:pPr>
       <w:r>
@@ -1494,7 +1578,7 @@
     <w:p>
       <w:pPr>
         <w:pStyle w:val="Textoembloco"/>
-        <w:ind w:left="284"/>
+        <w:ind w:left="284" w:right="0"/>
         <w:jc w:val="both"/>
       </w:pPr>
       <w:r>
@@ -1526,21 +1610,6 @@
     </w:p>
     <w:p>
       <w:pPr>
-        <w:rPr>
-          <w:b/>
-          <w:bCs/>
-        </w:rPr>
-      </w:pPr>
-      <w:r>
-        <w:rPr>
-          <w:b/>
-          <w:bCs/>
-        </w:rPr>
-        <w:br w:type="page"/>
-      </w:r>
-    </w:p>
-    <w:p>
-      <w:pPr>
         <w:pStyle w:val="Corpodetexto"/>
         <w:jc w:val="both"/>
       </w:pPr>
@@ -1549,40 +1618,40 @@
           <w:b/>
           <w:bCs/>
         </w:rPr>
+        <w:t>Art. 15</w:t>
+      </w:r>
+      <w:r>
+        <w:t xml:space="preserve"> – A lista de inscritos estará disponível na página do evento no site da FECORI para conferência. O técnico do clube e o próprio atleta são responsáveis por verificar os dados registrados e solicitar eventuais correções até 5 (cinco) dias antes da competição. As eventuais correções solicitadas no prazo devem constar na lista de partida até 1 (um) dia antes da competição.</w:t>
+      </w:r>
+    </w:p>
+    <w:p>
+      <w:pPr>
+        <w:pStyle w:val="Textoembloco"/>
+        <w:ind w:left="284" w:right="0"/>
+        <w:jc w:val="both"/>
+      </w:pPr>
+      <w:r>
+        <w:rPr>
+          <w:b/>
+          <w:bCs/>
+        </w:rPr>
+        <w:t>Parágrafo Único:</w:t>
+      </w:r>
+      <w:r>
+        <w:t xml:space="preserve"> Passado o prazo, o organizador pode recusar correções, e o atleta competirá com os dados registrados, assumindo, inclusive, riscos de desclassificação ou perda de pontuação.</w:t>
+      </w:r>
+    </w:p>
+    <w:p>
+      <w:pPr>
+        <w:pStyle w:val="FirstParagraph"/>
+        <w:jc w:val="both"/>
+      </w:pPr>
+      <w:r>
+        <w:rPr>
+          <w:b/>
+          <w:bCs/>
+        </w:rPr>
         <w:lastRenderedPageBreak/>
-        <w:t>Art. 15</w:t>
-      </w:r>
-      <w:r>
-        <w:t xml:space="preserve"> – A lista de inscritos estará disponível na página do evento no site da FECORI para conferência. O técnico do clube e o próprio atleta são responsáveis por verificar os dados registrados e solicitar eventuais correções até 5 (cinco) dias antes da competição. As eventuais correções solicitadas no prazo devem constar na lista de partida até 1 (um) dia antes da competição.</w:t>
-      </w:r>
-    </w:p>
-    <w:p>
-      <w:pPr>
-        <w:pStyle w:val="Textoembloco"/>
-        <w:ind w:left="284"/>
-        <w:jc w:val="both"/>
-      </w:pPr>
-      <w:r>
-        <w:rPr>
-          <w:b/>
-          <w:bCs/>
-        </w:rPr>
-        <w:t>Parágrafo Único:</w:t>
-      </w:r>
-      <w:r>
-        <w:t xml:space="preserve"> Passado o prazo, o organizador pode recusar correções, e o atleta competirá com os dados registrados, assumindo, inclusive, riscos de desclassificação ou perda de pontuação.</w:t>
-      </w:r>
-    </w:p>
-    <w:p>
-      <w:pPr>
-        <w:pStyle w:val="FirstParagraph"/>
-        <w:jc w:val="both"/>
-      </w:pPr>
-      <w:r>
-        <w:rPr>
-          <w:b/>
-          <w:bCs/>
-        </w:rPr>
         <w:t>Art. 16</w:t>
       </w:r>
       <w:r>
@@ -1661,7 +1730,15 @@
         <w:t>Art. 20</w:t>
       </w:r>
       <w:r>
-        <w:t xml:space="preserve"> – Se declarada a impossibilidade de utilização do sistema eletrônico (SPORTident), será utilizada apuração através de cartão de controle (papel impermeabilizado). Taxas de aluguel de SI-Card serão devolvidas.</w:t>
+        <w:t xml:space="preserve"> – Se declarada a impossibilidade de utilização do sistema eletrônico (</w:t>
+      </w:r>
+      <w:proofErr w:type="spellStart"/>
+      <w:r>
+        <w:t>SPORTident</w:t>
+      </w:r>
+      <w:proofErr w:type="spellEnd"/>
+      <w:r>
+        <w:t>), será utilizada apuração através de cartão de controle (papel impermeabilizado). Taxas de aluguel de SI-Card serão devolvidas.</w:t>
       </w:r>
     </w:p>
     <w:p>
@@ -1709,7 +1786,7 @@
     <w:p>
       <w:pPr>
         <w:pStyle w:val="Textoembloco"/>
-        <w:ind w:left="284"/>
+        <w:ind w:left="284" w:right="0"/>
         <w:jc w:val="both"/>
       </w:pPr>
       <w:r>
@@ -1726,7 +1803,7 @@
     <w:p>
       <w:pPr>
         <w:pStyle w:val="Textoembloco"/>
-        <w:ind w:left="284"/>
+        <w:ind w:left="284" w:right="0"/>
         <w:jc w:val="both"/>
       </w:pPr>
       <w:r>
@@ -1759,7 +1836,7 @@
     <w:p>
       <w:pPr>
         <w:pStyle w:val="Textoembloco"/>
-        <w:ind w:left="284"/>
+        <w:ind w:left="284" w:right="0"/>
         <w:jc w:val="both"/>
       </w:pPr>
       <w:r>
@@ -1803,7 +1880,7 @@
     <w:p>
       <w:pPr>
         <w:pStyle w:val="Textoembloco"/>
-        <w:ind w:left="284"/>
+        <w:ind w:left="284" w:right="0"/>
         <w:jc w:val="both"/>
       </w:pPr>
       <w:r>
@@ -1819,21 +1896,6 @@
     </w:p>
     <w:p>
       <w:pPr>
-        <w:rPr>
-          <w:b/>
-          <w:bCs/>
-        </w:rPr>
-      </w:pPr>
-      <w:r>
-        <w:rPr>
-          <w:b/>
-          <w:bCs/>
-        </w:rPr>
-        <w:br w:type="page"/>
-      </w:r>
-    </w:p>
-    <w:p>
-      <w:pPr>
         <w:pStyle w:val="FirstParagraph"/>
         <w:jc w:val="both"/>
       </w:pPr>
@@ -1842,7 +1904,6 @@
           <w:b/>
           <w:bCs/>
         </w:rPr>
-        <w:lastRenderedPageBreak/>
         <w:t>Art. 25</w:t>
       </w:r>
       <w:r>
@@ -1859,14 +1920,7 @@
           <w:b/>
           <w:bCs/>
         </w:rPr>
-        <w:t>A</w:t>
-      </w:r>
-      <w:r>
-        <w:rPr>
-          <w:b/>
-          <w:bCs/>
-        </w:rPr>
-        <w:t>rt. 26</w:t>
+        <w:t>Art. 26</w:t>
       </w:r>
       <w:r>
         <w:t xml:space="preserve"> – Após a divulgação do </w:t>
@@ -1883,7 +1937,7 @@
     <w:p>
       <w:pPr>
         <w:pStyle w:val="Textoembloco"/>
-        <w:ind w:left="284"/>
+        <w:ind w:left="284" w:right="0"/>
         <w:jc w:val="both"/>
       </w:pPr>
       <w:r>
@@ -1918,7 +1972,40 @@
         <w:t>Art. 27</w:t>
       </w:r>
       <w:r>
-        <w:t xml:space="preserve"> – O objetivo, composição e prerrogativas do Júri Técnico obedecem às DIRETRIZES PARA OS JÚRIS EM EVENTOS OFICIAIS da CBO e ao item 38 da ROP.</w:t>
+        <w:t xml:space="preserve"> – O objetivo, composição e prerrogativas do Júri Técnico obedecem às </w:t>
+      </w:r>
+      <w:r>
+        <w:rPr>
+          <w:smallCaps/>
+        </w:rPr>
+        <w:t xml:space="preserve">Diretrizes Para </w:t>
+      </w:r>
+      <w:r>
+        <w:rPr>
+          <w:smallCaps/>
+        </w:rPr>
+        <w:t>o</w:t>
+      </w:r>
+      <w:r>
+        <w:rPr>
+          <w:smallCaps/>
+        </w:rPr>
+        <w:t xml:space="preserve">s Júris </w:t>
+      </w:r>
+      <w:r>
+        <w:rPr>
+          <w:smallCaps/>
+        </w:rPr>
+        <w:t>e</w:t>
+      </w:r>
+      <w:r>
+        <w:rPr>
+          <w:smallCaps/>
+        </w:rPr>
+        <w:t>m Eventos Oficiais</w:t>
+      </w:r>
+      <w:r>
+        <w:t xml:space="preserve"> da CBO e ao item 38 da ROP.</w:t>
       </w:r>
     </w:p>
     <w:p>
@@ -1929,6 +2016,7 @@
       <w:bookmarkStart w:id="9" w:name="da-segurança"/>
       <w:bookmarkEnd w:id="8"/>
       <w:r>
+        <w:lastRenderedPageBreak/>
         <w:t>7. Da Segurança</w:t>
       </w:r>
     </w:p>
@@ -2030,7 +2118,7 @@
     <w:p>
       <w:pPr>
         <w:pStyle w:val="Textoembloco"/>
-        <w:ind w:left="284"/>
+        <w:ind w:left="284" w:right="0"/>
         <w:jc w:val="both"/>
       </w:pPr>
       <w:r>
@@ -2047,7 +2135,7 @@
     <w:p>
       <w:pPr>
         <w:pStyle w:val="Textoembloco"/>
-        <w:ind w:left="284"/>
+        <w:ind w:left="284" w:right="0"/>
         <w:jc w:val="both"/>
       </w:pPr>
       <w:r>
@@ -2064,7 +2152,7 @@
     <w:p>
       <w:pPr>
         <w:pStyle w:val="Textoembloco"/>
-        <w:ind w:left="284"/>
+        <w:ind w:left="284" w:right="0"/>
         <w:jc w:val="both"/>
       </w:pPr>
       <w:r>
@@ -2097,7 +2185,7 @@
     <w:p>
       <w:pPr>
         <w:pStyle w:val="Textoembloco"/>
-        <w:ind w:left="284"/>
+        <w:ind w:left="284" w:right="0"/>
         <w:jc w:val="both"/>
       </w:pPr>
       <w:r>
@@ -2114,7 +2202,7 @@
     <w:p>
       <w:pPr>
         <w:pStyle w:val="Textoembloco"/>
-        <w:ind w:left="284"/>
+        <w:ind w:left="284" w:right="0"/>
         <w:jc w:val="both"/>
       </w:pPr>
       <w:r>
@@ -2157,23 +2245,15 @@
     <w:p>
       <w:pPr>
         <w:pStyle w:val="Textoembloco"/>
-        <w:ind w:left="284"/>
-        <w:jc w:val="both"/>
-      </w:pPr>
-      <w:r>
-        <w:rPr>
-          <w:b/>
-          <w:bCs/>
-        </w:rPr>
-        <w:lastRenderedPageBreak/>
-        <w:t>P</w:t>
-      </w:r>
-      <w:r>
-        <w:rPr>
-          <w:b/>
-          <w:bCs/>
-        </w:rPr>
-        <w:t>arágrafo 1º (CCO):</w:t>
+        <w:ind w:left="284" w:right="0"/>
+        <w:jc w:val="both"/>
+      </w:pPr>
+      <w:r>
+        <w:rPr>
+          <w:b/>
+          <w:bCs/>
+        </w:rPr>
+        <w:t>Parágrafo 1º (CCO):</w:t>
       </w:r>
       <w:r>
         <w:t xml:space="preserve"> O atleta precisa participar de pelo menos metade das etapas realizadas no campeonato anual — </w:t>
@@ -2192,7 +2272,7 @@
     <w:p>
       <w:pPr>
         <w:pStyle w:val="Textoembloco"/>
-        <w:ind w:left="284"/>
+        <w:ind w:left="284" w:right="0"/>
         <w:jc w:val="both"/>
       </w:pPr>
       <w:r>
@@ -2209,7 +2289,7 @@
     <w:p>
       <w:pPr>
         <w:pStyle w:val="Textoembloco"/>
-        <w:ind w:left="284"/>
+        <w:ind w:left="284" w:right="0"/>
         <w:jc w:val="both"/>
       </w:pPr>
       <w:r>
@@ -2226,14 +2306,15 @@
     <w:p>
       <w:pPr>
         <w:pStyle w:val="Textoembloco"/>
-        <w:ind w:left="284"/>
-        <w:jc w:val="both"/>
-      </w:pPr>
-      <w:r>
-        <w:rPr>
-          <w:b/>
-          <w:bCs/>
-        </w:rPr>
+        <w:ind w:left="284" w:right="0"/>
+        <w:jc w:val="both"/>
+      </w:pPr>
+      <w:r>
+        <w:rPr>
+          <w:b/>
+          <w:bCs/>
+        </w:rPr>
+        <w:lastRenderedPageBreak/>
         <w:t>Parágrafo 4º:</w:t>
       </w:r>
       <w:r>
@@ -2243,7 +2324,7 @@
     <w:p>
       <w:pPr>
         <w:pStyle w:val="Textoembloco"/>
-        <w:ind w:left="284"/>
+        <w:ind w:left="284" w:right="0"/>
         <w:jc w:val="both"/>
       </w:pPr>
       <w:r>
@@ -2296,7 +2377,7 @@
     <w:p>
       <w:pPr>
         <w:pStyle w:val="Textoembloco"/>
-        <w:ind w:left="284"/>
+        <w:ind w:left="284" w:right="0"/>
         <w:jc w:val="both"/>
       </w:pPr>
       <w:r>
@@ -2323,7 +2404,7 @@
     <w:p>
       <w:pPr>
         <w:pStyle w:val="Textoembloco"/>
-        <w:ind w:left="284"/>
+        <w:ind w:left="284" w:right="0"/>
         <w:jc w:val="both"/>
       </w:pPr>
       <w:r>
@@ -2390,7 +2471,7 @@
     <w:p>
       <w:pPr>
         <w:pStyle w:val="Textoembloco"/>
-        <w:ind w:left="284"/>
+        <w:ind w:left="284" w:right="0"/>
         <w:jc w:val="both"/>
       </w:pPr>
       <w:r>
@@ -2485,21 +2566,6 @@
     </w:p>
     <w:p>
       <w:pPr>
-        <w:rPr>
-          <w:b/>
-          <w:bCs/>
-        </w:rPr>
-      </w:pPr>
-      <w:r>
-        <w:rPr>
-          <w:b/>
-          <w:bCs/>
-        </w:rPr>
-        <w:br w:type="page"/>
-      </w:r>
-    </w:p>
-    <w:p>
-      <w:pPr>
         <w:pStyle w:val="Corpodetexto"/>
         <w:jc w:val="both"/>
       </w:pPr>
@@ -2508,15 +2574,7 @@
           <w:b/>
           <w:bCs/>
         </w:rPr>
-        <w:lastRenderedPageBreak/>
-        <w:t>A</w:t>
-      </w:r>
-      <w:r>
-        <w:rPr>
-          <w:b/>
-          <w:bCs/>
-        </w:rPr>
-        <w:t>rt. 39</w:t>
+        <w:t>Art. 39</w:t>
       </w:r>
       <w:r>
         <w:t xml:space="preserve"> – Os </w:t>
@@ -2561,7 +2619,7 @@
     <w:p>
       <w:pPr>
         <w:pStyle w:val="Textoembloco"/>
-        <w:ind w:left="284"/>
+        <w:ind w:left="284" w:right="0"/>
         <w:jc w:val="both"/>
       </w:pPr>
       <w:r>
@@ -2578,7 +2636,7 @@
     <w:p>
       <w:pPr>
         <w:pStyle w:val="Textoembloco"/>
-        <w:ind w:left="284"/>
+        <w:ind w:left="284" w:right="0"/>
         <w:jc w:val="both"/>
       </w:pPr>
       <w:r>
@@ -2745,7 +2803,7 @@
       <w:rPr>
         <w:noProof/>
       </w:rPr>
-      <w:t>06/05/26 18:13</w:t>
+      <w:t>06/05/26 21:45</w:t>
     </w:r>
     <w:r>
       <w:rPr>

</xml_diff>